<commit_message>
court(hawtax): motion-brief gated on the shared model; cover opens with counsel beside the clerk's 3-inch band, HRS 232-1 marked by find, last paragraph kept with the closing (fb-595.54.76)
Co-Authored-By: Claude Opus 5.5 <noreply@anthropic.com>
</commit_message>
<xml_diff>
--- a/courts/ninth-circuit/hawaii/state/state-tax-appeal-court/motion-brief/usage/OUTPUT-motion-brief.docx
+++ b/courts/ninth-circuit/hawaii/state/state-tax-appeal-court/motion-brief/usage/OUTPUT-motion-brief.docx
@@ -2,572 +2,648 @@
 <file path=word/document.xml><?xml version="1.0" encoding="utf-8"?>
 <w:document xmlns:w="http://schemas.openxmlformats.org/wordprocessingml/2006/main" xmlns:m="http://schemas.openxmlformats.org/officeDocument/2006/math" xmlns:r="http://schemas.openxmlformats.org/officeDocument/2006/relationships" xmlns:o="urn:schemas-microsoft-com:office:office" xmlns:v="urn:schemas-microsoft-com:vml" xmlns:w10="urn:schemas-microsoft-com:office:word" xmlns:a="http://schemas.openxmlformats.org/drawingml/2006/main" xmlns:pic="http://schemas.openxmlformats.org/drawingml/2006/picture" xmlns:wp="http://schemas.openxmlformats.org/drawingml/2006/wordprocessingDrawing">
   <w:body>
-    <w:p>
-      <w:pPr>
-        <w:spacing w:before="0" w:after="0" w:line="276" w:lineRule="exact"/>
-        <w:ind w:left="0" w:right="4320" w:firstLine="0"/>
-        <w:jc w:val="left"/>
-      </w:pPr>
-      <w:r>
-        <w:t xml:space="preserve">CLARE</w:t>
-      </w:r>
-      <w:r>
-        <w:t xml:space="preserve"> </w:t>
-      </w:r>
-      <w:r>
-        <w:t xml:space="preserve">E.</w:t>
-      </w:r>
-      <w:r>
-        <w:t xml:space="preserve"> </w:t>
-      </w:r>
-      <w:r>
-        <w:t xml:space="preserve">CONNORS</w:t>
-      </w:r>
-    </w:p>
-    <w:p>
-      <w:pPr>
-        <w:spacing w:before="0" w:after="0" w:line="276" w:lineRule="exact"/>
-        <w:ind w:left="0" w:right="4320" w:firstLine="0"/>
-        <w:jc w:val="left"/>
-      </w:pPr>
-      <w:r>
-        <w:t xml:space="preserve">7936</w:t>
-      </w:r>
-    </w:p>
-    <w:p>
-      <w:pPr>
-        <w:spacing w:before="0" w:after="96" w:line="276" w:lineRule="exact"/>
-        <w:ind w:left="0" w:right="4320" w:firstLine="0"/>
-        <w:jc w:val="left"/>
-      </w:pPr>
-      <w:r>
-        <w:t xml:space="preserve">Attorney</w:t>
-      </w:r>
-      <w:r>
-        <w:t xml:space="preserve"> </w:t>
-      </w:r>
-      <w:r>
-        <w:t xml:space="preserve">General</w:t>
-      </w:r>
-      <w:r>
-        <w:t xml:space="preserve"> </w:t>
-      </w:r>
-      <w:r>
-        <w:t xml:space="preserve">of</w:t>
-      </w:r>
-      <w:r>
-        <w:t xml:space="preserve"> </w:t>
-      </w:r>
-      <w:r>
-        <w:t xml:space="preserve">Hawaii</w:t>
-      </w:r>
-    </w:p>
-    <w:p>
-      <w:pPr>
-        <w:spacing w:before="0" w:after="0" w:line="276" w:lineRule="exact"/>
-        <w:ind w:left="0" w:right="4320" w:firstLine="0"/>
-        <w:jc w:val="left"/>
-      </w:pPr>
-      <w:r>
-        <w:t xml:space="preserve">GARY</w:t>
-      </w:r>
-      <w:r>
-        <w:t xml:space="preserve"> </w:t>
-      </w:r>
-      <w:r>
-        <w:t xml:space="preserve">S.</w:t>
-      </w:r>
-      <w:r>
-        <w:t xml:space="preserve"> </w:t>
-      </w:r>
-      <w:r>
-        <w:t xml:space="preserve">SUGANUMA</w:t>
-      </w:r>
-    </w:p>
-    <w:p>
-      <w:pPr>
-        <w:spacing w:before="0" w:after="0" w:line="276" w:lineRule="exact"/>
-        <w:ind w:left="0" w:right="4320" w:firstLine="0"/>
-        <w:jc w:val="left"/>
-      </w:pPr>
-      <w:r>
-        <w:t xml:space="preserve">6960</w:t>
-      </w:r>
-    </w:p>
-    <w:p>
-      <w:pPr>
-        <w:spacing w:before="0" w:after="0" w:line="276" w:lineRule="exact"/>
-        <w:ind w:left="0" w:right="4320" w:firstLine="0"/>
-        <w:jc w:val="left"/>
-      </w:pPr>
-      <w:r>
-        <w:t xml:space="preserve">Deputy</w:t>
-      </w:r>
-      <w:r>
-        <w:t xml:space="preserve"> </w:t>
-      </w:r>
-      <w:r>
-        <w:t xml:space="preserve">Attorneys</w:t>
-      </w:r>
-      <w:r>
-        <w:t xml:space="preserve"> </w:t>
-      </w:r>
-      <w:r>
-        <w:t xml:space="preserve">General</w:t>
-      </w:r>
-    </w:p>
-    <w:p>
-      <w:pPr>
-        <w:spacing w:before="0" w:after="0" w:line="276" w:lineRule="exact"/>
-        <w:ind w:left="0" w:right="4320" w:firstLine="0"/>
-        <w:jc w:val="left"/>
-      </w:pPr>
-      <w:r>
-        <w:t xml:space="preserve">Department</w:t>
-      </w:r>
-      <w:r>
-        <w:t xml:space="preserve"> </w:t>
-      </w:r>
-      <w:r>
-        <w:t xml:space="preserve">of</w:t>
-      </w:r>
-      <w:r>
-        <w:t xml:space="preserve"> </w:t>
-      </w:r>
-      <w:r>
-        <w:t xml:space="preserve">the</w:t>
-      </w:r>
-      <w:r>
-        <w:t xml:space="preserve"> </w:t>
-      </w:r>
-      <w:r>
-        <w:t xml:space="preserve">Attorney</w:t>
-      </w:r>
-      <w:r>
-        <w:t xml:space="preserve"> </w:t>
-      </w:r>
-      <w:r>
-        <w:t xml:space="preserve">General,</w:t>
-      </w:r>
-      <w:r>
-        <w:t xml:space="preserve"> </w:t>
-      </w:r>
-      <w:r>
-        <w:t xml:space="preserve">State</w:t>
-      </w:r>
-      <w:r>
-        <w:t xml:space="preserve"> </w:t>
-      </w:r>
-      <w:r>
-        <w:t xml:space="preserve">of</w:t>
-      </w:r>
-      <w:r>
-        <w:t xml:space="preserve"> </w:t>
-      </w:r>
-      <w:r>
-        <w:t xml:space="preserve">Hawaii</w:t>
-      </w:r>
-    </w:p>
-    <w:p>
-      <w:pPr>
-        <w:spacing w:before="0" w:after="0" w:line="276" w:lineRule="exact"/>
-        <w:ind w:left="0" w:right="4320" w:firstLine="0"/>
-        <w:jc w:val="left"/>
-      </w:pPr>
-      <w:r>
-        <w:t xml:space="preserve">425</w:t>
-      </w:r>
-      <w:r>
-        <w:t xml:space="preserve"> </w:t>
-      </w:r>
-      <w:r>
-        <w:t xml:space="preserve">Queen</w:t>
-      </w:r>
-      <w:r>
-        <w:t xml:space="preserve"> </w:t>
-      </w:r>
-      <w:r>
-        <w:t xml:space="preserve">Street</w:t>
-      </w:r>
-    </w:p>
-    <w:p>
-      <w:pPr>
-        <w:spacing w:before="0" w:after="0" w:line="276" w:lineRule="exact"/>
-        <w:ind w:left="0" w:right="4320" w:firstLine="0"/>
-        <w:jc w:val="left"/>
-      </w:pPr>
-      <w:r>
-        <w:t xml:space="preserve">Honolulu,</w:t>
-      </w:r>
-      <w:r>
-        <w:t xml:space="preserve"> </w:t>
-      </w:r>
-      <w:r>
-        <w:t xml:space="preserve">Hawaii</w:t>
-      </w:r>
-      <w:r>
-        <w:t xml:space="preserve"> </w:t>
-      </w:r>
-      <w:r>
-        <w:t xml:space="preserve">96813</w:t>
-      </w:r>
-    </w:p>
-    <w:p>
-      <w:pPr>
-        <w:spacing w:before="0" w:after="0" w:line="276" w:lineRule="exact"/>
-        <w:ind w:left="0" w:right="4320" w:firstLine="0"/>
-        <w:jc w:val="left"/>
-      </w:pPr>
-      <w:r>
-        <w:t xml:space="preserve">Telephone:</w:t>
-      </w:r>
-      <w:r>
-        <w:t xml:space="preserve"> </w:t>
-      </w:r>
-      <w:r>
-        <w:t xml:space="preserve">(808)</w:t>
-      </w:r>
-      <w:r>
-        <w:t xml:space="preserve"> </w:t>
-      </w:r>
-      <w:r>
-        <w:t xml:space="preserve">586</w:t>
-        <w:noBreakHyphen/>
-        <w:t xml:space="preserve">1470</w:t>
-      </w:r>
-    </w:p>
-    <w:p>
-      <w:pPr>
-        <w:spacing w:before="0" w:after="96" w:line="276" w:lineRule="exact"/>
-        <w:ind w:left="0" w:right="4320" w:firstLine="0"/>
-        <w:jc w:val="left"/>
-      </w:pPr>
-      <w:r>
-        <w:t xml:space="preserve">email:</w:t>
-      </w:r>
-      <w:r>
-        <w:t xml:space="preserve"> </w:t>
-      </w:r>
-      <w:r>
-        <w:t xml:space="preserve">gary.s.suganuma@hawaii.gov</w:t>
-      </w:r>
-    </w:p>
-    <w:p>
-      <w:pPr>
-        <w:spacing w:before="0" w:after="0" w:line="276" w:lineRule="exact"/>
-        <w:ind w:left="0" w:right="4320" w:firstLine="0"/>
-        <w:jc w:val="left"/>
-      </w:pPr>
-      <w:r>
-        <w:t xml:space="preserve">KRISTEN</w:t>
-      </w:r>
-      <w:r>
-        <w:t xml:space="preserve"> </w:t>
-      </w:r>
-      <w:r>
-        <w:t xml:space="preserve">M.R.</w:t>
-      </w:r>
-      <w:r>
-        <w:t xml:space="preserve"> </w:t>
-      </w:r>
-      <w:r>
-        <w:t xml:space="preserve">SAKAMOTO</w:t>
-      </w:r>
-    </w:p>
-    <w:p>
-      <w:pPr>
-        <w:spacing w:before="0" w:after="0" w:line="276" w:lineRule="exact"/>
-        <w:ind w:left="0" w:right="4320" w:firstLine="0"/>
-        <w:jc w:val="left"/>
-      </w:pPr>
-      <w:r>
-        <w:t xml:space="preserve">9279</w:t>
-      </w:r>
-    </w:p>
-    <w:p>
-      <w:pPr>
-        <w:spacing w:before="0" w:after="0" w:line="276" w:lineRule="exact"/>
-        <w:ind w:left="0" w:right="4320" w:firstLine="0"/>
-        <w:jc w:val="left"/>
-      </w:pPr>
-      <w:r>
-        <w:t xml:space="preserve">Deputy</w:t>
-      </w:r>
-      <w:r>
-        <w:t xml:space="preserve"> </w:t>
-      </w:r>
-      <w:r>
-        <w:t xml:space="preserve">Attorneys</w:t>
-      </w:r>
-      <w:r>
-        <w:t xml:space="preserve"> </w:t>
-      </w:r>
-      <w:r>
-        <w:t xml:space="preserve">General</w:t>
-      </w:r>
-    </w:p>
-    <w:p>
-      <w:pPr>
-        <w:spacing w:before="0" w:after="0" w:line="276" w:lineRule="exact"/>
-        <w:ind w:left="0" w:right="4320" w:firstLine="0"/>
-        <w:jc w:val="left"/>
-      </w:pPr>
-      <w:r>
-        <w:t xml:space="preserve">Department</w:t>
-      </w:r>
-      <w:r>
-        <w:t xml:space="preserve"> </w:t>
-      </w:r>
-      <w:r>
-        <w:t xml:space="preserve">of</w:t>
-      </w:r>
-      <w:r>
-        <w:t xml:space="preserve"> </w:t>
-      </w:r>
-      <w:r>
-        <w:t xml:space="preserve">the</w:t>
-      </w:r>
-      <w:r>
-        <w:t xml:space="preserve"> </w:t>
-      </w:r>
-      <w:r>
-        <w:t xml:space="preserve">Attorney</w:t>
-      </w:r>
-      <w:r>
-        <w:t xml:space="preserve"> </w:t>
-      </w:r>
-      <w:r>
-        <w:t xml:space="preserve">General,</w:t>
-      </w:r>
-      <w:r>
-        <w:t xml:space="preserve"> </w:t>
-      </w:r>
-      <w:r>
-        <w:t xml:space="preserve">State</w:t>
-      </w:r>
-      <w:r>
-        <w:t xml:space="preserve"> </w:t>
-      </w:r>
-      <w:r>
-        <w:t xml:space="preserve">of</w:t>
-      </w:r>
-      <w:r>
-        <w:t xml:space="preserve"> </w:t>
-      </w:r>
-      <w:r>
-        <w:t xml:space="preserve">Hawaii</w:t>
-      </w:r>
-    </w:p>
-    <w:p>
-      <w:pPr>
-        <w:spacing w:before="0" w:after="0" w:line="276" w:lineRule="exact"/>
-        <w:ind w:left="0" w:right="4320" w:firstLine="0"/>
-        <w:jc w:val="left"/>
-      </w:pPr>
-      <w:r>
-        <w:t xml:space="preserve">425</w:t>
-      </w:r>
-      <w:r>
-        <w:t xml:space="preserve"> </w:t>
-      </w:r>
-      <w:r>
-        <w:t xml:space="preserve">Queen</w:t>
-      </w:r>
-      <w:r>
-        <w:t xml:space="preserve"> </w:t>
-      </w:r>
-      <w:r>
-        <w:t xml:space="preserve">Street</w:t>
-      </w:r>
-    </w:p>
-    <w:p>
-      <w:pPr>
-        <w:spacing w:before="0" w:after="0" w:line="276" w:lineRule="exact"/>
-        <w:ind w:left="0" w:right="4320" w:firstLine="0"/>
-        <w:jc w:val="left"/>
-      </w:pPr>
-      <w:r>
-        <w:t xml:space="preserve">Honolulu,</w:t>
-      </w:r>
-      <w:r>
-        <w:t xml:space="preserve"> </w:t>
-      </w:r>
-      <w:r>
-        <w:t xml:space="preserve">Hawaii</w:t>
-      </w:r>
-      <w:r>
-        <w:t xml:space="preserve"> </w:t>
-      </w:r>
-      <w:r>
-        <w:t xml:space="preserve">96813</w:t>
-      </w:r>
-    </w:p>
-    <w:p>
-      <w:pPr>
-        <w:spacing w:before="0" w:after="0" w:line="276" w:lineRule="exact"/>
-        <w:ind w:left="0" w:right="4320" w:firstLine="0"/>
-        <w:jc w:val="left"/>
-      </w:pPr>
-      <w:r>
-        <w:t xml:space="preserve">Telephone:</w:t>
-      </w:r>
-      <w:r>
-        <w:t xml:space="preserve"> </w:t>
-      </w:r>
-      <w:r>
-        <w:t xml:space="preserve">(808)</w:t>
-      </w:r>
-      <w:r>
-        <w:t xml:space="preserve"> </w:t>
-      </w:r>
-      <w:r>
-        <w:t xml:space="preserve">586</w:t>
-        <w:noBreakHyphen/>
-        <w:t xml:space="preserve">1470</w:t>
-      </w:r>
-    </w:p>
-    <w:p>
-      <w:pPr>
-        <w:spacing w:before="0" w:after="96" w:line="276" w:lineRule="exact"/>
-        <w:ind w:left="0" w:right="4320" w:firstLine="0"/>
-        <w:jc w:val="left"/>
-      </w:pPr>
-      <w:r>
-        <w:t xml:space="preserve">email:</w:t>
-      </w:r>
-      <w:r>
-        <w:t xml:space="preserve"> </w:t>
-      </w:r>
-      <w:r>
-        <w:t xml:space="preserve">kristen.m.sakamoto@hawaii.gov</w:t>
-      </w:r>
-    </w:p>
-    <w:p>
-      <w:pPr>
-        <w:spacing w:before="0" w:after="0" w:line="276" w:lineRule="exact"/>
-        <w:ind w:left="0" w:right="4320" w:firstLine="0"/>
-        <w:jc w:val="left"/>
-      </w:pPr>
-      <w:r>
-        <w:rPr>
-          <w:i/>
-          <w:iCs/>
-        </w:rPr>
-        <w:t xml:space="preserve">Attorneys</w:t>
-      </w:r>
-      <w:r>
-        <w:rPr>
-          <w:i/>
-          <w:iCs/>
-        </w:rPr>
-        <w:t xml:space="preserve"> </w:t>
-      </w:r>
-      <w:r>
-        <w:rPr>
-          <w:i/>
-          <w:iCs/>
-        </w:rPr>
-        <w:t xml:space="preserve">for</w:t>
-      </w:r>
-      <w:r>
-        <w:rPr>
-          <w:i/>
-          <w:iCs/>
-        </w:rPr>
-        <w:t xml:space="preserve"> </w:t>
-      </w:r>
-      <w:r>
-        <w:rPr>
-          <w:i/>
-          <w:iCs/>
-        </w:rPr>
-        <w:t xml:space="preserve">Appellee</w:t>
-      </w:r>
-      <w:r>
-        <w:rPr>
-          <w:i/>
-          <w:iCs/>
-        </w:rPr>
-        <w:t xml:space="preserve"> </w:t>
-      </w:r>
-      <w:r>
-        <w:rPr>
-          <w:i/>
-          <w:iCs/>
-        </w:rPr>
-        <w:t xml:space="preserve">DIRECTOR</w:t>
-      </w:r>
-      <w:r>
-        <w:rPr>
-          <w:i/>
-          <w:iCs/>
-        </w:rPr>
-        <w:t xml:space="preserve"> </w:t>
-      </w:r>
-      <w:r>
-        <w:rPr>
-          <w:i/>
-          <w:iCs/>
-        </w:rPr>
-        <w:t xml:space="preserve">OF</w:t>
-      </w:r>
-      <w:r>
-        <w:rPr>
-          <w:i/>
-          <w:iCs/>
-        </w:rPr>
-        <w:t xml:space="preserve"> </w:t>
-      </w:r>
-      <w:r>
-        <w:rPr>
-          <w:i/>
-          <w:iCs/>
-        </w:rPr>
-        <w:t xml:space="preserve">TAXATION,</w:t>
-      </w:r>
-      <w:r>
-        <w:rPr>
-          <w:i/>
-          <w:iCs/>
-        </w:rPr>
-        <w:t xml:space="preserve"> </w:t>
-      </w:r>
-      <w:r>
-        <w:rPr>
-          <w:i/>
-          <w:iCs/>
-        </w:rPr>
-        <w:t xml:space="preserve">STATE</w:t>
-      </w:r>
-      <w:r>
-        <w:rPr>
-          <w:i/>
-          <w:iCs/>
-        </w:rPr>
-        <w:t xml:space="preserve"> </w:t>
-      </w:r>
-      <w:r>
-        <w:rPr>
-          <w:i/>
-          <w:iCs/>
-        </w:rPr>
-        <w:t xml:space="preserve">OF</w:t>
-      </w:r>
-      <w:r>
-        <w:rPr>
-          <w:i/>
-          <w:iCs/>
-        </w:rPr>
-        <w:t xml:space="preserve"> </w:t>
-      </w:r>
-      <w:r>
-        <w:rPr>
-          <w:i/>
-          <w:iCs/>
-        </w:rPr>
-        <w:t xml:space="preserve">HAWAII</w:t>
-      </w:r>
-    </w:p>
+    <w:tbl>
+      <w:tblPr>
+        <w:tblW w:w="9360" w:type="dxa"/>
+        <w:tblLayout w:type="fixed"/>
+        <w:tblCellMar>
+          <w:top w:w="0" w:type="dxa"/>
+          <w:left w:w="0" w:type="dxa"/>
+          <w:bottom w:w="0" w:type="dxa"/>
+          <w:right w:w="0" w:type="dxa"/>
+        </w:tblCellMar>
+        <w:tblLook w:val="0000" w:firstRow="0" w:lastRow="0" w:firstColumn="0" w:lastColumn="0" w:noHBand="0" w:noVBand="0"/>
+      </w:tblPr>
+      <w:tblGrid>
+        <w:gridCol w:w="5040"/>
+        <w:gridCol w:w="4320"/>
+      </w:tblGrid>
+      <w:tr>
+        <w:trPr>
+          <w:cantSplit/>
+        </w:trPr>
+        <w:tc>
+          <w:tcPr>
+            <w:tcW w:w="5040" w:type="dxa"/>
+          </w:tcPr>
+          <w:p>
+            <w:pPr>
+              <w:spacing w:before="0" w:after="0" w:line="276" w:lineRule="exact"/>
+              <w:ind w:left="0" w:firstLine="0"/>
+              <w:jc w:val="left"/>
+            </w:pPr>
+            <w:r>
+              <w:t xml:space="preserve">CLARE</w:t>
+            </w:r>
+            <w:r>
+              <w:t xml:space="preserve"> </w:t>
+            </w:r>
+            <w:r>
+              <w:t xml:space="preserve">E.</w:t>
+            </w:r>
+            <w:r>
+              <w:t xml:space="preserve"> </w:t>
+            </w:r>
+            <w:r>
+              <w:t xml:space="preserve">CONNORS</w:t>
+            </w:r>
+          </w:p>
+          <w:p>
+            <w:pPr>
+              <w:spacing w:before="0" w:after="0" w:line="276" w:lineRule="exact"/>
+              <w:ind w:left="0" w:firstLine="0"/>
+              <w:jc w:val="left"/>
+            </w:pPr>
+            <w:r>
+              <w:t xml:space="preserve">7936</w:t>
+            </w:r>
+          </w:p>
+          <w:p>
+            <w:pPr>
+              <w:spacing w:before="0" w:after="96" w:line="276" w:lineRule="exact"/>
+              <w:ind w:left="0" w:firstLine="0"/>
+              <w:jc w:val="left"/>
+            </w:pPr>
+            <w:r>
+              <w:t xml:space="preserve">Attorney</w:t>
+            </w:r>
+            <w:r>
+              <w:t xml:space="preserve"> </w:t>
+            </w:r>
+            <w:r>
+              <w:t xml:space="preserve">General</w:t>
+            </w:r>
+            <w:r>
+              <w:t xml:space="preserve"> </w:t>
+            </w:r>
+            <w:r>
+              <w:t xml:space="preserve">of</w:t>
+            </w:r>
+            <w:r>
+              <w:t xml:space="preserve"> </w:t>
+            </w:r>
+            <w:r>
+              <w:t xml:space="preserve">Hawaii</w:t>
+            </w:r>
+          </w:p>
+          <w:p>
+            <w:pPr>
+              <w:spacing w:before="0" w:after="0" w:line="276" w:lineRule="exact"/>
+              <w:ind w:left="0" w:firstLine="0"/>
+              <w:jc w:val="left"/>
+            </w:pPr>
+            <w:r>
+              <w:t xml:space="preserve">GARY</w:t>
+            </w:r>
+            <w:r>
+              <w:t xml:space="preserve"> </w:t>
+            </w:r>
+            <w:r>
+              <w:t xml:space="preserve">S.</w:t>
+            </w:r>
+            <w:r>
+              <w:t xml:space="preserve"> </w:t>
+            </w:r>
+            <w:r>
+              <w:t xml:space="preserve">SUGANUMA</w:t>
+            </w:r>
+          </w:p>
+          <w:p>
+            <w:pPr>
+              <w:spacing w:before="0" w:after="0" w:line="276" w:lineRule="exact"/>
+              <w:ind w:left="0" w:firstLine="0"/>
+              <w:jc w:val="left"/>
+            </w:pPr>
+            <w:r>
+              <w:t xml:space="preserve">6960</w:t>
+            </w:r>
+          </w:p>
+          <w:p>
+            <w:pPr>
+              <w:spacing w:before="0" w:after="0" w:line="276" w:lineRule="exact"/>
+              <w:ind w:left="0" w:firstLine="0"/>
+              <w:jc w:val="left"/>
+            </w:pPr>
+            <w:r>
+              <w:t xml:space="preserve">Deputy</w:t>
+            </w:r>
+            <w:r>
+              <w:t xml:space="preserve"> </w:t>
+            </w:r>
+            <w:r>
+              <w:t xml:space="preserve">Attorneys</w:t>
+            </w:r>
+            <w:r>
+              <w:t xml:space="preserve"> </w:t>
+            </w:r>
+            <w:r>
+              <w:t xml:space="preserve">General</w:t>
+            </w:r>
+          </w:p>
+          <w:p>
+            <w:pPr>
+              <w:spacing w:before="0" w:after="0" w:line="276" w:lineRule="exact"/>
+              <w:ind w:left="0" w:firstLine="0"/>
+              <w:jc w:val="left"/>
+            </w:pPr>
+            <w:r>
+              <w:t xml:space="preserve">Department</w:t>
+            </w:r>
+            <w:r>
+              <w:t xml:space="preserve"> </w:t>
+            </w:r>
+            <w:r>
+              <w:t xml:space="preserve">of</w:t>
+            </w:r>
+            <w:r>
+              <w:t xml:space="preserve"> </w:t>
+            </w:r>
+            <w:r>
+              <w:t xml:space="preserve">the</w:t>
+            </w:r>
+            <w:r>
+              <w:t xml:space="preserve"> </w:t>
+            </w:r>
+            <w:r>
+              <w:t xml:space="preserve">Attorney</w:t>
+            </w:r>
+            <w:r>
+              <w:t xml:space="preserve"> </w:t>
+            </w:r>
+            <w:r>
+              <w:t xml:space="preserve">General,</w:t>
+            </w:r>
+            <w:r>
+              <w:t xml:space="preserve"> </w:t>
+            </w:r>
+            <w:r>
+              <w:t xml:space="preserve">State</w:t>
+            </w:r>
+            <w:r>
+              <w:t xml:space="preserve"> </w:t>
+            </w:r>
+            <w:r>
+              <w:t xml:space="preserve">of</w:t>
+            </w:r>
+            <w:r>
+              <w:t xml:space="preserve"> </w:t>
+            </w:r>
+            <w:r>
+              <w:t xml:space="preserve">Hawaii</w:t>
+            </w:r>
+          </w:p>
+          <w:p>
+            <w:pPr>
+              <w:spacing w:before="0" w:after="0" w:line="276" w:lineRule="exact"/>
+              <w:ind w:left="0" w:firstLine="0"/>
+              <w:jc w:val="left"/>
+            </w:pPr>
+            <w:r>
+              <w:t xml:space="preserve">425</w:t>
+            </w:r>
+            <w:r>
+              <w:t xml:space="preserve"> </w:t>
+            </w:r>
+            <w:r>
+              <w:t xml:space="preserve">Queen</w:t>
+            </w:r>
+            <w:r>
+              <w:t xml:space="preserve"> </w:t>
+            </w:r>
+            <w:r>
+              <w:t xml:space="preserve">Street</w:t>
+            </w:r>
+          </w:p>
+          <w:p>
+            <w:pPr>
+              <w:spacing w:before="0" w:after="0" w:line="276" w:lineRule="exact"/>
+              <w:ind w:left="0" w:firstLine="0"/>
+              <w:jc w:val="left"/>
+            </w:pPr>
+            <w:r>
+              <w:t xml:space="preserve">Honolulu,</w:t>
+            </w:r>
+            <w:r>
+              <w:t xml:space="preserve"> </w:t>
+            </w:r>
+            <w:r>
+              <w:t xml:space="preserve">Hawaii</w:t>
+            </w:r>
+            <w:r>
+              <w:t xml:space="preserve"> </w:t>
+            </w:r>
+            <w:r>
+              <w:t xml:space="preserve">96813</w:t>
+            </w:r>
+          </w:p>
+          <w:p>
+            <w:pPr>
+              <w:spacing w:before="0" w:after="0" w:line="276" w:lineRule="exact"/>
+              <w:ind w:left="0" w:firstLine="0"/>
+              <w:jc w:val="left"/>
+            </w:pPr>
+            <w:r>
+              <w:t xml:space="preserve">Telephone:</w:t>
+            </w:r>
+            <w:r>
+              <w:t xml:space="preserve"> </w:t>
+            </w:r>
+            <w:r>
+              <w:t xml:space="preserve">(808)</w:t>
+            </w:r>
+            <w:r>
+              <w:t xml:space="preserve"> </w:t>
+            </w:r>
+            <w:r>
+              <w:t xml:space="preserve">586</w:t>
+              <w:noBreakHyphen/>
+              <w:t xml:space="preserve">1470</w:t>
+            </w:r>
+          </w:p>
+          <w:p>
+            <w:pPr>
+              <w:spacing w:before="0" w:after="96" w:line="276" w:lineRule="exact"/>
+              <w:ind w:left="0" w:firstLine="0"/>
+              <w:jc w:val="left"/>
+            </w:pPr>
+            <w:r>
+              <w:t xml:space="preserve">email:</w:t>
+            </w:r>
+            <w:r>
+              <w:t xml:space="preserve"> </w:t>
+            </w:r>
+            <w:r>
+              <w:t xml:space="preserve">gary.s.suganuma@hawaii.gov</w:t>
+            </w:r>
+          </w:p>
+          <w:p>
+            <w:pPr>
+              <w:spacing w:before="0" w:after="0" w:line="276" w:lineRule="exact"/>
+              <w:ind w:left="0" w:firstLine="0"/>
+              <w:jc w:val="left"/>
+            </w:pPr>
+            <w:r>
+              <w:t xml:space="preserve">KRISTEN</w:t>
+            </w:r>
+            <w:r>
+              <w:t xml:space="preserve"> </w:t>
+            </w:r>
+            <w:r>
+              <w:t xml:space="preserve">M.R.</w:t>
+            </w:r>
+            <w:r>
+              <w:t xml:space="preserve"> </w:t>
+            </w:r>
+            <w:r>
+              <w:t xml:space="preserve">SAKAMOTO</w:t>
+            </w:r>
+          </w:p>
+          <w:p>
+            <w:pPr>
+              <w:spacing w:before="0" w:after="0" w:line="276" w:lineRule="exact"/>
+              <w:ind w:left="0" w:firstLine="0"/>
+              <w:jc w:val="left"/>
+            </w:pPr>
+            <w:r>
+              <w:t xml:space="preserve">9279</w:t>
+            </w:r>
+          </w:p>
+          <w:p>
+            <w:pPr>
+              <w:spacing w:before="0" w:after="0" w:line="276" w:lineRule="exact"/>
+              <w:ind w:left="0" w:firstLine="0"/>
+              <w:jc w:val="left"/>
+            </w:pPr>
+            <w:r>
+              <w:t xml:space="preserve">Deputy</w:t>
+            </w:r>
+            <w:r>
+              <w:t xml:space="preserve"> </w:t>
+            </w:r>
+            <w:r>
+              <w:t xml:space="preserve">Attorneys</w:t>
+            </w:r>
+            <w:r>
+              <w:t xml:space="preserve"> </w:t>
+            </w:r>
+            <w:r>
+              <w:t xml:space="preserve">General</w:t>
+            </w:r>
+          </w:p>
+          <w:p>
+            <w:pPr>
+              <w:spacing w:before="0" w:after="0" w:line="276" w:lineRule="exact"/>
+              <w:ind w:left="0" w:firstLine="0"/>
+              <w:jc w:val="left"/>
+            </w:pPr>
+            <w:r>
+              <w:t xml:space="preserve">Department</w:t>
+            </w:r>
+            <w:r>
+              <w:t xml:space="preserve"> </w:t>
+            </w:r>
+            <w:r>
+              <w:t xml:space="preserve">of</w:t>
+            </w:r>
+            <w:r>
+              <w:t xml:space="preserve"> </w:t>
+            </w:r>
+            <w:r>
+              <w:t xml:space="preserve">the</w:t>
+            </w:r>
+            <w:r>
+              <w:t xml:space="preserve"> </w:t>
+            </w:r>
+            <w:r>
+              <w:t xml:space="preserve">Attorney</w:t>
+            </w:r>
+            <w:r>
+              <w:t xml:space="preserve"> </w:t>
+            </w:r>
+            <w:r>
+              <w:t xml:space="preserve">General,</w:t>
+            </w:r>
+            <w:r>
+              <w:t xml:space="preserve"> </w:t>
+            </w:r>
+            <w:r>
+              <w:t xml:space="preserve">State</w:t>
+            </w:r>
+            <w:r>
+              <w:t xml:space="preserve"> </w:t>
+            </w:r>
+            <w:r>
+              <w:t xml:space="preserve">of</w:t>
+            </w:r>
+            <w:r>
+              <w:t xml:space="preserve"> </w:t>
+            </w:r>
+            <w:r>
+              <w:t xml:space="preserve">Hawaii</w:t>
+            </w:r>
+          </w:p>
+          <w:p>
+            <w:pPr>
+              <w:spacing w:before="0" w:after="0" w:line="276" w:lineRule="exact"/>
+              <w:ind w:left="0" w:firstLine="0"/>
+              <w:jc w:val="left"/>
+            </w:pPr>
+            <w:r>
+              <w:t xml:space="preserve">425</w:t>
+            </w:r>
+            <w:r>
+              <w:t xml:space="preserve"> </w:t>
+            </w:r>
+            <w:r>
+              <w:t xml:space="preserve">Queen</w:t>
+            </w:r>
+            <w:r>
+              <w:t xml:space="preserve"> </w:t>
+            </w:r>
+            <w:r>
+              <w:t xml:space="preserve">Street</w:t>
+            </w:r>
+          </w:p>
+          <w:p>
+            <w:pPr>
+              <w:spacing w:before="0" w:after="0" w:line="276" w:lineRule="exact"/>
+              <w:ind w:left="0" w:firstLine="0"/>
+              <w:jc w:val="left"/>
+            </w:pPr>
+            <w:r>
+              <w:t xml:space="preserve">Honolulu,</w:t>
+            </w:r>
+            <w:r>
+              <w:t xml:space="preserve"> </w:t>
+            </w:r>
+            <w:r>
+              <w:t xml:space="preserve">Hawaii</w:t>
+            </w:r>
+            <w:r>
+              <w:t xml:space="preserve"> </w:t>
+            </w:r>
+            <w:r>
+              <w:t xml:space="preserve">96813</w:t>
+            </w:r>
+          </w:p>
+          <w:p>
+            <w:pPr>
+              <w:spacing w:before="0" w:after="0" w:line="276" w:lineRule="exact"/>
+              <w:ind w:left="0" w:firstLine="0"/>
+              <w:jc w:val="left"/>
+            </w:pPr>
+            <w:r>
+              <w:t xml:space="preserve">Telephone:</w:t>
+            </w:r>
+            <w:r>
+              <w:t xml:space="preserve"> </w:t>
+            </w:r>
+            <w:r>
+              <w:t xml:space="preserve">(808)</w:t>
+            </w:r>
+            <w:r>
+              <w:t xml:space="preserve"> </w:t>
+            </w:r>
+            <w:r>
+              <w:t xml:space="preserve">586</w:t>
+              <w:noBreakHyphen/>
+              <w:t xml:space="preserve">1470</w:t>
+            </w:r>
+          </w:p>
+          <w:p>
+            <w:pPr>
+              <w:spacing w:before="0" w:after="96" w:line="276" w:lineRule="exact"/>
+              <w:ind w:left="0" w:firstLine="0"/>
+              <w:jc w:val="left"/>
+            </w:pPr>
+            <w:r>
+              <w:t xml:space="preserve">email:</w:t>
+            </w:r>
+            <w:r>
+              <w:t xml:space="preserve"> </w:t>
+            </w:r>
+            <w:r>
+              <w:t xml:space="preserve">kristen.m.sakamoto@hawaii.gov</w:t>
+            </w:r>
+          </w:p>
+          <w:p>
+            <w:pPr>
+              <w:spacing w:before="0" w:after="0" w:line="276" w:lineRule="exact"/>
+              <w:ind w:left="0" w:firstLine="0"/>
+              <w:jc w:val="left"/>
+            </w:pPr>
+            <w:r>
+              <w:rPr>
+                <w:i/>
+                <w:iCs/>
+              </w:rPr>
+              <w:t xml:space="preserve">Attorneys</w:t>
+            </w:r>
+            <w:r>
+              <w:rPr>
+                <w:i/>
+                <w:iCs/>
+              </w:rPr>
+              <w:t xml:space="preserve"> </w:t>
+            </w:r>
+            <w:r>
+              <w:rPr>
+                <w:i/>
+                <w:iCs/>
+              </w:rPr>
+              <w:t xml:space="preserve">for</w:t>
+            </w:r>
+            <w:r>
+              <w:rPr>
+                <w:i/>
+                <w:iCs/>
+              </w:rPr>
+              <w:t xml:space="preserve"> </w:t>
+            </w:r>
+            <w:r>
+              <w:rPr>
+                <w:i/>
+                <w:iCs/>
+              </w:rPr>
+              <w:t xml:space="preserve">Appellee</w:t>
+            </w:r>
+            <w:r>
+              <w:rPr>
+                <w:i/>
+                <w:iCs/>
+              </w:rPr>
+              <w:t xml:space="preserve"> </w:t>
+            </w:r>
+            <w:r>
+              <w:rPr>
+                <w:i/>
+                <w:iCs/>
+              </w:rPr>
+              <w:t xml:space="preserve">DIRECTOR</w:t>
+            </w:r>
+            <w:r>
+              <w:rPr>
+                <w:i/>
+                <w:iCs/>
+              </w:rPr>
+              <w:t xml:space="preserve"> </w:t>
+            </w:r>
+            <w:r>
+              <w:rPr>
+                <w:i/>
+                <w:iCs/>
+              </w:rPr>
+              <w:t xml:space="preserve">OF</w:t>
+            </w:r>
+            <w:r>
+              <w:rPr>
+                <w:i/>
+                <w:iCs/>
+              </w:rPr>
+              <w:t xml:space="preserve"> </w:t>
+            </w:r>
+            <w:r>
+              <w:rPr>
+                <w:i/>
+                <w:iCs/>
+              </w:rPr>
+              <w:t xml:space="preserve">TAXATION,</w:t>
+            </w:r>
+            <w:r>
+              <w:rPr>
+                <w:i/>
+                <w:iCs/>
+              </w:rPr>
+              <w:t xml:space="preserve"> </w:t>
+            </w:r>
+            <w:r>
+              <w:rPr>
+                <w:i/>
+                <w:iCs/>
+              </w:rPr>
+              <w:t xml:space="preserve">STATE</w:t>
+            </w:r>
+            <w:r>
+              <w:rPr>
+                <w:i/>
+                <w:iCs/>
+              </w:rPr>
+              <w:t xml:space="preserve"> </w:t>
+            </w:r>
+            <w:r>
+              <w:rPr>
+                <w:i/>
+                <w:iCs/>
+              </w:rPr>
+              <w:t xml:space="preserve">OF</w:t>
+            </w:r>
+            <w:r>
+              <w:rPr>
+                <w:i/>
+                <w:iCs/>
+              </w:rPr>
+              <w:t xml:space="preserve"> </w:t>
+            </w:r>
+            <w:r>
+              <w:rPr>
+                <w:i/>
+                <w:iCs/>
+              </w:rPr>
+              <w:t xml:space="preserve">HAWAII</w:t>
+            </w:r>
+          </w:p>
+        </w:tc>
+        <w:tc>
+          <w:tcPr>
+            <w:tcW w:w="4320" w:type="dxa"/>
+          </w:tcPr>
+          <w:tbl>
+            <w:tblPr>
+              <w:tblW w:w="4320" w:type="dxa"/>
+              <w:tblInd w:w="0" w:type="dxa"/>
+              <w:tblBorders>
+                <w:top w:val="nil"/>
+                <w:left w:val="nil"/>
+                <w:bottom w:val="nil"/>
+                <w:right w:val="nil"/>
+              </w:tblBorders>
+              <w:tblLayout w:type="fixed"/>
+              <w:tblCellMar>
+                <w:top w:w="0" w:type="dxa"/>
+                <w:left w:w="0" w:type="dxa"/>
+                <w:bottom w:w="0" w:type="dxa"/>
+                <w:right w:w="0" w:type="dxa"/>
+              </w:tblCellMar>
+              <w:tblLook w:val="0000" w:firstRow="0" w:lastRow="0" w:firstColumn="0" w:lastColumn="0" w:noHBand="0" w:noVBand="0"/>
+            </w:tblPr>
+            <w:tblGrid>
+              <w:gridCol w:w="4320"/>
+            </w:tblGrid>
+            <w:tr>
+              <w:trPr>
+                <w:cantSplit/>
+                <w:trHeight w:val="4320" w:hRule="exact"/>
+              </w:trPr>
+              <w:tc>
+                <w:tcPr>
+                  <w:tcW w:w="4320" w:type="dxa"/>
+                </w:tcPr>
+                <w:p>
+                  <w:pPr>
+                    <w:spacing w:before="0" w:after="0" w:line="1" w:lineRule="exact"/>
+                  </w:pPr>
+                </w:p>
+              </w:tc>
+            </w:tr>
+          </w:tbl>
+          <w:p>
+            <w:pPr>
+              <w:spacing w:before="0" w:after="0" w:line="1" w:lineRule="exact"/>
+            </w:pPr>
+          </w:p>
+        </w:tc>
+      </w:tr>
+    </w:tbl>
     <w:p>
       <w:pPr>
         <w:spacing w:before="432" w:after="0" w:line="276" w:lineRule="exact"/>
@@ -1412,10 +1488,7 @@
         <w:ind w:left="1440" w:right="480" w:hanging="720"/>
       </w:pPr>
       <w:r>
-        <w:t xml:space="preserve">I.</w:t>
-      </w:r>
-      <w:r>
-        <w:t xml:space="preserve"> </w:t>
+        <w:t xml:space="preserve">I. </w:t>
       </w:r>
       <w:r>
         <w:t xml:space="preserve">STANDARD</w:t>
@@ -1452,10 +1525,7 @@
         <w:ind w:left="1440" w:right="480" w:hanging="720"/>
       </w:pPr>
       <w:r>
-        <w:t xml:space="preserve">II.</w:t>
-      </w:r>
-      <w:r>
-        <w:t xml:space="preserve"> </w:t>
+        <w:t xml:space="preserve">II. </w:t>
       </w:r>
       <w:r>
         <w:t xml:space="preserve">THE</w:t>
@@ -1540,10 +1610,7 @@
         <w:ind w:left="2160" w:right="480" w:hanging="720"/>
       </w:pPr>
       <w:r>
-        <w:t xml:space="preserve">A.</w:t>
-      </w:r>
-      <w:r>
-        <w:t xml:space="preserve"> </w:t>
+        <w:t xml:space="preserve">A. </w:t>
       </w:r>
       <w:r>
         <w:t xml:space="preserve">An</w:t>
@@ -1600,9 +1667,7 @@
         <w:t xml:space="preserve"> </w:t>
       </w:r>
       <w:r>
-        <w:t xml:space="preserve">237</w:t>
-        <w:noBreakHyphen/>
-        <w:t xml:space="preserve">41.5</w:t>
+        <w:t xml:space="preserve">237-⁠41.5</w:t>
       </w:r>
       <w:r>
         <w:t xml:space="preserve"> </w:t>
@@ -1660,10 +1725,7 @@
         <w:ind w:left="2880" w:right="480" w:hanging="720"/>
       </w:pPr>
       <w:r>
-        <w:t xml:space="preserve">1.</w:t>
-      </w:r>
-      <w:r>
-        <w:t xml:space="preserve"> </w:t>
+        <w:t xml:space="preserve">1. </w:t>
       </w:r>
       <w:r>
         <w:t xml:space="preserve">An</w:t>
@@ -1832,10 +1894,7 @@
         <w:ind w:left="2880" w:right="480" w:hanging="720"/>
       </w:pPr>
       <w:r>
-        <w:t xml:space="preserve">2.</w:t>
-      </w:r>
-      <w:r>
-        <w:t xml:space="preserve"> </w:t>
+        <w:t xml:space="preserve">2. </w:t>
       </w:r>
       <w:r>
         <w:t xml:space="preserve">An</w:t>
@@ -1998,10 +2057,7 @@
         <w:ind w:left="2160" w:right="480" w:hanging="720"/>
       </w:pPr>
       <w:r>
-        <w:t xml:space="preserve">B.</w:t>
-      </w:r>
-      <w:r>
-        <w:t xml:space="preserve"> </w:t>
+        <w:t xml:space="preserve">B. </w:t>
       </w:r>
       <w:r>
         <w:t xml:space="preserve">An</w:t>
@@ -2104,10 +2160,7 @@
         <w:ind w:left="2160" w:right="480" w:hanging="720"/>
       </w:pPr>
       <w:r>
-        <w:t xml:space="preserve">C.</w:t>
-      </w:r>
-      <w:r>
-        <w:t xml:space="preserve"> </w:t>
+        <w:t xml:space="preserve">C. </w:t>
       </w:r>
       <w:r>
         <w:t xml:space="preserve">Appellant</w:t>
@@ -2164,9 +2217,7 @@
         <w:t xml:space="preserve"> </w:t>
       </w:r>
       <w:r>
-        <w:t xml:space="preserve">40</w:t>
-        <w:noBreakHyphen/>
-        <w:t xml:space="preserve">35</w:t>
+        <w:t xml:space="preserve">40-⁠35</w:t>
       </w:r>
       <w:r>
         <w:t xml:space="preserve"> </w:t>
@@ -2298,9 +2349,7 @@
         <w:t xml:space="preserve"> </w:t>
       </w:r>
       <w:r>
-        <w:t xml:space="preserve">237</w:t>
-        <w:noBreakHyphen/>
-        <w:t xml:space="preserve">41.5.</w:t>
+        <w:t xml:space="preserve">237-⁠41.5.</w:t>
       </w:r>
       <w:r>
         <w:t xml:space="preserve">   </w:t>
@@ -2331,7 +2380,7 @@
         <w:tab/>
       </w:r>
       <w:r>
-        <w:t xml:space="preserve">15</w:t>
+        <w:t xml:space="preserve">16</w:t>
       </w:r>
     </w:p>
     <w:p>
@@ -3759,7 +3808,7 @@
           <w:tab w:val="right" w:leader="dot" w:pos="9360"/>
         </w:tabs>
         <w:spacing w:before="168" w:after="0" w:line="276" w:lineRule="exact"/>
-        <w:ind w:left="504" w:right="2640" w:hanging="504"/>
+        <w:ind w:left="504" w:right="3000" w:hanging="504"/>
       </w:pPr>
       <w:r>
         <w:t xml:space="preserve">HRS</w:t>
@@ -3785,7 +3834,7 @@
         <w:tab/>
       </w:r>
       <w:r>
-        <w:t xml:space="preserve">5, 6, 8, 9, 10, 11, 13, 14, 15</w:t>
+        <w:t xml:space="preserve">5, 6, 8, 9, 10, 11, 13, 14, 15, 16</w:t>
       </w:r>
     </w:p>
     <w:p>
@@ -4403,61 +4452,31 @@
         <w:pStyle w:val="BodyText"/>
       </w:pPr>
       <w:r>
-        <w:t xml:space="preserve">The Hawaii Revised Statutes (HRS) confers jurisdiction on the Tax Appeal Court to hear appeals from (1) assessments pursuant to HRS § 237</w:t>
-      </w:r>
-      <w:r>
-        <w:noBreakHyphen/>
-      </w:r>
-      <w:r>
-        <w:t xml:space="preserve">42,</w:t>
-      </w:r>
-      <w:r>
-        <w:t xml:space="preserve"> </w:t>
-      </w:r>
-      <w:r>
-        <w:t xml:space="preserve">(2) denials of refund claims pursuant to HRS § 232</w:t>
-      </w:r>
-      <w:r>
-        <w:noBreakHyphen/>
-      </w:r>
-      <w:r>
-        <w:t xml:space="preserve">14.5,</w:t>
-      </w:r>
-      <w:r>
-        <w:t xml:space="preserve"> </w:t>
-      </w:r>
-      <w:r>
-        <w:t xml:space="preserve">and (3) payments under protest pursuant to HRS § 40</w:t>
-      </w:r>
-      <w:r>
-        <w:noBreakHyphen/>
-      </w:r>
-      <w:r>
-        <w:t xml:space="preserve">35.</w:t>
-      </w:r>
-      <w:r>
-        <w:t xml:space="preserve"> </w:t>
-      </w:r>
-      <w:r>
-        <w:t xml:space="preserve">The Final Notice of Personal Liability for General Excise Tax, which was issued pursuant to HRS § 237</w:t>
-      </w:r>
-      <w:r>
-        <w:noBreakHyphen/>
-      </w:r>
-      <w:r>
-        <w:t xml:space="preserve">41.5,</w:t>
-      </w:r>
-      <w:r>
-        <w:t xml:space="preserve"> </w:t>
-      </w:r>
-      <w:r>
-        <w:t xml:space="preserve">is not an assessment or a denial of a refund claim. Accordingly, the Final Notice of Personal Liability for General Excise Tax may only be appealed to the Tax Appeal Court under HRS § 40</w:t>
-      </w:r>
-      <w:r>
-        <w:noBreakHyphen/>
-      </w:r>
-      <w:r>
-        <w:t xml:space="preserve">35</w:t>
+        <w:t xml:space="preserve">The Hawaii Revised Statutes (HRS) confers jurisdiction on the Tax Appeal Court to hear appeals from (1) assessments pursuant to HRS § 237-⁠42,</w:t>
+      </w:r>
+      <w:r>
+        <w:t xml:space="preserve"> </w:t>
+      </w:r>
+      <w:r>
+        <w:t xml:space="preserve">(2) denials of refund claims pursuant to HRS § 232-⁠14.5,</w:t>
+      </w:r>
+      <w:r>
+        <w:t xml:space="preserve"> </w:t>
+      </w:r>
+      <w:r>
+        <w:t xml:space="preserve">and (3) payments under protest pursuant to HRS § 40-⁠35.</w:t>
+      </w:r>
+      <w:r>
+        <w:t xml:space="preserve"> </w:t>
+      </w:r>
+      <w:r>
+        <w:t xml:space="preserve">The Final Notice of Personal Liability for General Excise Tax, which was issued pursuant to HRS § 237-⁠41.5,</w:t>
+      </w:r>
+      <w:r>
+        <w:t xml:space="preserve"> </w:t>
+      </w:r>
+      <w:r>
+        <w:t xml:space="preserve">is not an assessment or a denial of a refund claim. Accordingly, the Final Notice of Personal Liability for General Excise Tax may only be appealed to the Tax Appeal Court under HRS § 40-⁠35</w:t>
       </w:r>
       <w:r>
         <w:t xml:space="preserve"> </w:t>
@@ -4515,25 +4534,13 @@
         <w:pStyle w:val="BodyText"/>
       </w:pPr>
       <w:r>
-        <w:t xml:space="preserve">On December 22, 2020, The Department of Taxation, State of Hawaii (DOTAX) issued Appellant a Final Notice of Personal Liability for General Excise Tax pursuant to HRS § 237</w:t>
-      </w:r>
-      <w:r>
-        <w:noBreakHyphen/>
-      </w:r>
-      <w:r>
-        <w:t xml:space="preserve">41.5</w:t>
-      </w:r>
-      <w:r>
-        <w:t xml:space="preserve"> </w:t>
-      </w:r>
-      <w:r>
-        <w:t xml:space="preserve">for taxes owed by Kailua Print Shop L.L.C. (Ex. A.) The Final Notice of Personal Liability for General Excise Tax sought to recover $79,596.16 in principal, penalties, and interest for tax years 2015 to 2019 and for the period ending March 31, 2020. (Ex. A.) DOTAX also issued Appellant a Notice of Final Assessment of Withholding Tax pursuant to HRS § 235</w:t>
-      </w:r>
-      <w:r>
-        <w:noBreakHyphen/>
-      </w:r>
-      <w:r>
-        <w:t xml:space="preserve">64</w:t>
+        <w:t xml:space="preserve">On December 22, 2020, The Department of Taxation, State of Hawaii (DOTAX) issued Appellant a Final Notice of Personal Liability for General Excise Tax pursuant to HRS § 237-⁠41.5</w:t>
+      </w:r>
+      <w:r>
+        <w:t xml:space="preserve"> </w:t>
+      </w:r>
+      <w:r>
+        <w:t xml:space="preserve">for taxes owed by Kailua Print Shop L.L.C. (Ex. A.) The Final Notice of Personal Liability for General Excise Tax sought to recover $79,596.16 in principal, penalties, and interest for tax years 2015 to 2019 and for the period ending March 31, 2020. (Ex. A.) DOTAX also issued Appellant a Notice of Final Assessment of Withholding Tax pursuant to HRS § 235-⁠64</w:t>
       </w:r>
       <w:r>
         <w:t xml:space="preserve"> </w:t>
@@ -4574,6 +4581,10 @@
         <w:t xml:space="preserve">I.</w:t>
       </w:r>
       <w:r>
+        <w:rPr>
+          <w:b/>
+          <w:bCs/>
+        </w:rPr>
         <w:tab/>
       </w:r>
       <w:r>
@@ -4720,6 +4731,10 @@
         <w:t xml:space="preserve">II.</w:t>
       </w:r>
       <w:r>
+        <w:rPr>
+          <w:b/>
+          <w:bCs/>
+        </w:rPr>
         <w:tab/>
       </w:r>
       <w:r>
@@ -5003,37 +5018,19 @@
         <w:pStyle w:val="BodyText"/>
       </w:pPr>
       <w:r>
-        <w:t xml:space="preserve">With respect to general excise taxes, the HRS confers jurisdiction on the Tax Appeal Court to hear appeals from (1) assessments pursuant to HRS § 237</w:t>
-      </w:r>
-      <w:r>
-        <w:noBreakHyphen/>
-      </w:r>
-      <w:r>
-        <w:t xml:space="preserve">42,</w:t>
-      </w:r>
-      <w:r>
-        <w:t xml:space="preserve"> </w:t>
-      </w:r>
-      <w:r>
-        <w:t xml:space="preserve">(2) denials of refund claims pursuant to HRS § 232</w:t>
-      </w:r>
-      <w:r>
-        <w:noBreakHyphen/>
-      </w:r>
-      <w:r>
-        <w:t xml:space="preserve">14.5,</w:t>
-      </w:r>
-      <w:r>
-        <w:t xml:space="preserve"> </w:t>
-      </w:r>
-      <w:r>
-        <w:t xml:space="preserve">and (3) payments under protest pursuant to HRS § 40</w:t>
-      </w:r>
-      <w:r>
-        <w:noBreakHyphen/>
-      </w:r>
-      <w:r>
-        <w:t xml:space="preserve">35.</w:t>
+        <w:t xml:space="preserve">With respect to general excise taxes, the HRS confers jurisdiction on the Tax Appeal Court to hear appeals from (1) assessments pursuant to HRS § 237-⁠42,</w:t>
+      </w:r>
+      <w:r>
+        <w:t xml:space="preserve"> </w:t>
+      </w:r>
+      <w:r>
+        <w:t xml:space="preserve">(2) denials of refund claims pursuant to HRS § 232-⁠14.5,</w:t>
+      </w:r>
+      <w:r>
+        <w:t xml:space="preserve"> </w:t>
+      </w:r>
+      <w:r>
+        <w:t xml:space="preserve">and (3) payments under protest pursuant to HRS § 40-⁠35.</w:t>
       </w:r>
       <w:r>
         <w:t xml:space="preserve"> </w:t>
@@ -5058,6 +5055,10 @@
         <w:t xml:space="preserve">A.</w:t>
       </w:r>
       <w:r>
+        <w:rPr>
+          <w:b/>
+          <w:bCs/>
+        </w:rPr>
         <w:tab/>
       </w:r>
       <w:r>
@@ -5191,93 +5192,132 @@
           <w:b/>
           <w:bCs/>
         </w:rPr>
-        <w:t xml:space="preserve">237</w:t>
+        <w:t xml:space="preserve">237-⁠41.5</w:t>
+      </w:r>
+      <w:r>
+        <w:rPr>
+          <w:b/>
+          <w:bCs/>
+        </w:rPr>
+        <w:t xml:space="preserve"> </w:t>
+      </w:r>
+      <w:r>
+        <w:rPr>
+          <w:b/>
+          <w:bCs/>
+        </w:rPr>
+        <w:t xml:space="preserve">is</w:t>
+      </w:r>
+      <w:r>
+        <w:rPr>
+          <w:b/>
+          <w:bCs/>
+        </w:rPr>
+        <w:t xml:space="preserve"> </w:t>
+      </w:r>
+      <w:r>
+        <w:rPr>
+          <w:b/>
+          <w:bCs/>
+        </w:rPr>
+        <w:t xml:space="preserve">Not</w:t>
+      </w:r>
+      <w:r>
+        <w:rPr>
+          <w:b/>
+          <w:bCs/>
+        </w:rPr>
+        <w:t xml:space="preserve"> </w:t>
+      </w:r>
+      <w:r>
+        <w:rPr>
+          <w:b/>
+          <w:bCs/>
+        </w:rPr>
+        <w:t xml:space="preserve">Appealable</w:t>
+      </w:r>
+      <w:r>
+        <w:rPr>
+          <w:b/>
+          <w:bCs/>
+        </w:rPr>
+        <w:t xml:space="preserve"> </w:t>
+      </w:r>
+      <w:r>
+        <w:rPr>
+          <w:b/>
+          <w:bCs/>
+        </w:rPr>
+        <w:t xml:space="preserve">as</w:t>
+      </w:r>
+      <w:r>
+        <w:rPr>
+          <w:b/>
+          <w:bCs/>
+        </w:rPr>
+        <w:t xml:space="preserve"> </w:t>
+      </w:r>
+      <w:r>
+        <w:rPr>
+          <w:b/>
+          <w:bCs/>
+        </w:rPr>
+        <w:t xml:space="preserve">an</w:t>
+      </w:r>
+      <w:r>
+        <w:rPr>
+          <w:b/>
+          <w:bCs/>
+        </w:rPr>
+        <w:t xml:space="preserve"> </w:t>
+      </w:r>
+      <w:r>
+        <w:rPr>
+          <w:b/>
+          <w:bCs/>
+        </w:rPr>
+        <w:t xml:space="preserve">Assessment.</w:t>
+      </w:r>
+    </w:p>
+    <w:p>
+      <w:pPr>
+        <w:pStyle w:val="BodyText"/>
+      </w:pPr>
+      <w:r>
+        <w:t xml:space="preserve">HRS § 237-⁠42</w:t>
+      </w:r>
+      <w:r>
+        <w:t xml:space="preserve"> </w:t>
+      </w:r>
+      <w:r>
+        <w:t xml:space="preserve">provides that</w:t>
+      </w:r>
+      <w:r>
+        <w:t xml:space="preserve"> </w:t>
+      </w:r>
+      <w:r>
+        <w:t xml:space="preserve">“[a]ny person aggrieved by any assessment of the tax for any month or any year may appeal from the assessment in the manner and within the time and in all other respects as provided in the case of income tax appeals by section 235</w:t>
+      </w:r>
+      <w:r>
         <w:noBreakHyphen/>
-        <w:t xml:space="preserve">41.5</w:t>
-      </w:r>
-      <w:r>
-        <w:rPr>
-          <w:b/>
-          <w:bCs/>
-        </w:rPr>
-        <w:t xml:space="preserve"> </w:t>
-      </w:r>
-      <w:r>
-        <w:rPr>
-          <w:b/>
-          <w:bCs/>
-        </w:rPr>
-        <w:t xml:space="preserve">is</w:t>
-      </w:r>
-      <w:r>
-        <w:rPr>
-          <w:b/>
-          <w:bCs/>
-        </w:rPr>
-        <w:t xml:space="preserve"> </w:t>
-      </w:r>
-      <w:r>
-        <w:rPr>
-          <w:b/>
-          <w:bCs/>
-        </w:rPr>
-        <w:t xml:space="preserve">Not</w:t>
-      </w:r>
-      <w:r>
-        <w:rPr>
-          <w:b/>
-          <w:bCs/>
-        </w:rPr>
-        <w:t xml:space="preserve"> </w:t>
-      </w:r>
-      <w:r>
-        <w:rPr>
-          <w:b/>
-          <w:bCs/>
-        </w:rPr>
-        <w:t xml:space="preserve">Appealable</w:t>
-      </w:r>
-      <w:r>
-        <w:rPr>
-          <w:b/>
-          <w:bCs/>
-        </w:rPr>
-        <w:t xml:space="preserve"> </w:t>
-      </w:r>
-      <w:r>
-        <w:rPr>
-          <w:b/>
-          <w:bCs/>
-        </w:rPr>
-        <w:t xml:space="preserve">as</w:t>
-      </w:r>
-      <w:r>
-        <w:rPr>
-          <w:b/>
-          <w:bCs/>
-        </w:rPr>
-        <w:t xml:space="preserve"> </w:t>
-      </w:r>
-      <w:r>
-        <w:rPr>
-          <w:b/>
-          <w:bCs/>
-        </w:rPr>
-        <w:t xml:space="preserve">an</w:t>
-      </w:r>
-      <w:r>
-        <w:rPr>
-          <w:b/>
-          <w:bCs/>
-        </w:rPr>
-        <w:t xml:space="preserve"> </w:t>
-      </w:r>
-      <w:r>
-        <w:rPr>
-          <w:b/>
-          <w:bCs/>
-        </w:rPr>
-        <w:t xml:space="preserve">Assessment.</w:t>
+      </w:r>
+      <w:r>
+        <w:t xml:space="preserve">114.</w:t>
+      </w:r>
+      <w:r>
+        <w:t xml:space="preserve">”</w:t>
+      </w:r>
+      <w:r>
+        <w:t xml:space="preserve"> </w:t>
+      </w:r>
+      <w:r>
+        <w:t xml:space="preserve">HRS § 237-⁠42</w:t>
+      </w:r>
+      <w:r>
+        <w:t xml:space="preserve"> </w:t>
+      </w:r>
+      <w:r>
+        <w:t xml:space="preserve">(emphasis added).</w:t>
       </w:r>
     </w:p>
     <w:p>
@@ -5285,52 +5325,163 @@
         <w:pStyle w:val="BodyText"/>
       </w:pPr>
       <w:r>
-        <w:t xml:space="preserve">HRS § 237</w:t>
+        <w:t xml:space="preserve">An imposition of personal liability pursuant to HRS § 237-⁠41.5,</w:t>
+      </w:r>
+      <w:r>
+        <w:t xml:space="preserve"> </w:t>
+      </w:r>
+      <w:r>
+        <w:t xml:space="preserve">however, is not an</w:t>
+      </w:r>
+      <w:r>
+        <w:t xml:space="preserve"> </w:t>
+      </w:r>
+      <w:r>
+        <w:t xml:space="preserve">“assessment.”</w:t>
+      </w:r>
+      <w:r>
+        <w:t xml:space="preserve"> </w:t>
+      </w:r>
+      <w:r>
+        <w:t xml:space="preserve">HRS § 237-⁠41.5</w:t>
+      </w:r>
+      <w:r>
+        <w:t xml:space="preserve"> </w:t>
+      </w:r>
+      <w:r>
+        <w:t xml:space="preserve">provides:</w:t>
+      </w:r>
+    </w:p>
+    <w:p>
+      <w:pPr>
+        <w:pStyle w:val="XdQuoteFirst"/>
+      </w:pPr>
+      <w:r>
+        <w:t xml:space="preserve">(a) There shall be personal liability for the taxes imposed under this chapter as provided in this section for the following amounts of gross income or gross proceeds:</w:t>
+      </w:r>
+    </w:p>
+    <w:p>
+      <w:pPr>
+        <w:pStyle w:val="XdQuote"/>
+      </w:pPr>
+      <w:r>
+        <w:t xml:space="preserve">(1) Any amount collected as a recovery of the taxpayer’s liability under this chapter, where the amount is passed on as the tax owed by the taxpayer under this chapter for the transaction and is separately stated or accounted for in a receipt, contract, invoice, billing, or other evidence of the business activity; or</w:t>
+      </w:r>
+    </w:p>
+    <w:p>
+      <w:pPr>
+        <w:pStyle w:val="XdQuote"/>
+      </w:pPr>
+      <w:r>
+        <w:t xml:space="preserve">(2) An amount equal to the tax liability under this chapter on a transaction where a taxpayer does not separately state or account for the amount as a tax recovery as provided in paragraph (1). For purposes of this paragraph, the amount of the imputed tax liability is the result of multiplying the gross income or gross proceeds received in the transaction by the tax rate.</w:t>
+      </w:r>
+    </w:p>
+    <w:p>
+      <w:pPr>
+        <w:pStyle w:val="XdQuote"/>
+      </w:pPr>
+      <w:r>
+        <w:t xml:space="preserve">The amounts under paragraphs (1) and (2) shall be held in trust for the benefit of the State and for payment to the State in the manner and at the time required by this chapter.</w:t>
+      </w:r>
+    </w:p>
+    <w:p>
+      <w:pPr>
+        <w:pStyle w:val="XdQuote"/>
+      </w:pPr>
+      <w:r>
+        <w:t xml:space="preserve">(b) The personal liability under this section applies to any officer, member, manager, or other person having control or supervision over amounts of gross proceeds or gross income collected to pay the general excise tax and held in trust under subsection (a), or who is charged with the responsibility for the filing of returns or the payment of general excise tax on gross income or gross proceeds collected and held in trust under subsection (a). The person shall be personally liable for any unpaid taxes and interest and penalties on those taxes, if such officer or other person wilfully fails to pay or to cause to be paid any taxes due from the taxpayer pursuant to this chapter.</w:t>
+      </w:r>
+    </w:p>
+    <w:p>
+      <w:pPr>
+        <w:pStyle w:val="XdQuote"/>
+      </w:pPr>
+      <w:r>
+        <w:t xml:space="preserve">This subsection shall not apply to any officer, manager, or other person having control or supervision over amounts of gross proceeds or gross income collected to pay the general excise tax and held in trust under subsection (a), or who is charged with the responsibility for the filing of returns or the payment of general excise tax on gross income or gross proceeds collected and held in trust under subsection (a) for a nonprofit organization.</w:t>
+      </w:r>
+    </w:p>
+    <w:p>
+      <w:pPr>
+        <w:pStyle w:val="XdQuote"/>
+      </w:pPr>
+      <w:r>
+        <w:t xml:space="preserve">For purposes of this subsection:</w:t>
+      </w:r>
+    </w:p>
+    <w:p>
+      <w:pPr>
+        <w:pStyle w:val="XdQuote"/>
+      </w:pPr>
+      <w:r>
+        <w:t xml:space="preserve">“Nonprofit organization”</w:t>
+      </w:r>
+      <w:r>
+        <w:t xml:space="preserve"> </w:t>
+      </w:r>
+      <w:r>
+        <w:t xml:space="preserve">means a corporate entity, association, or other duly chartered entity that is registered with the State and is exempt from the application of this chapter pursuant to section 237</w:t>
       </w:r>
       <w:r>
         <w:noBreakHyphen/>
       </w:r>
       <w:r>
-        <w:t xml:space="preserve">42</w:t>
-      </w:r>
-      <w:r>
-        <w:t xml:space="preserve"> </w:t>
-      </w:r>
-      <w:r>
-        <w:t xml:space="preserve">provides that</w:t>
-      </w:r>
-      <w:r>
-        <w:t xml:space="preserve"> </w:t>
-      </w:r>
-      <w:r>
-        <w:t xml:space="preserve">“[a]ny person aggrieved by any assessment of the tax for any month or any year may appeal from the assessment in the manner and within the time and in all other respects as provided in the case of income tax appeals by section 235</w:t>
-      </w:r>
-      <w:r>
-        <w:noBreakHyphen/>
-      </w:r>
-      <w:r>
-        <w:t xml:space="preserve">114.</w:t>
-      </w:r>
-      <w:r>
-        <w:t xml:space="preserve">”</w:t>
-      </w:r>
-      <w:r>
-        <w:t xml:space="preserve"> </w:t>
-      </w:r>
-      <w:r>
-        <w:t xml:space="preserve">HRS § 237</w:t>
-      </w:r>
-      <w:r>
-        <w:noBreakHyphen/>
-      </w:r>
-      <w:r>
-        <w:t xml:space="preserve">42</w:t>
-      </w:r>
-      <w:r>
-        <w:t xml:space="preserve"> </w:t>
-      </w:r>
-      <w:r>
-        <w:t xml:space="preserve">(emphasis added).</w:t>
+        <w:t xml:space="preserve">23(a)⁠(3),</w:t>
+      </w:r>
+      <w:r>
+        <w:t xml:space="preserve"> </w:t>
+      </w:r>
+      <w:r>
+        <w:t xml:space="preserve">(4), (5), (6), or (7).</w:t>
+      </w:r>
+    </w:p>
+    <w:p>
+      <w:pPr>
+        <w:pStyle w:val="XdQuote"/>
+      </w:pPr>
+      <w:r>
+        <w:t xml:space="preserve">“Wilfully fails to pay or to cause to be paid”</w:t>
+      </w:r>
+      <w:r>
+        <w:t xml:space="preserve"> </w:t>
+      </w:r>
+      <w:r>
+        <w:t xml:space="preserve">shall be construed in accordance with judicial interpretations given to similar provisions of the Internal Revenue Code; consistent therewith, the term</w:t>
+      </w:r>
+      <w:r>
+        <w:t xml:space="preserve"> </w:t>
+      </w:r>
+      <w:r>
+        <w:t xml:space="preserve">“wilfully”</w:t>
+      </w:r>
+      <w:r>
+        <w:t xml:space="preserve"> </w:t>
+      </w:r>
+      <w:r>
+        <w:t xml:space="preserve">shall mean a voluntary, intentional violation of a known legal duty.</w:t>
+      </w:r>
+    </w:p>
+    <w:p>
+      <w:pPr>
+        <w:pStyle w:val="XdQuote"/>
+      </w:pPr>
+      <w:r>
+        <w:t xml:space="preserve">(c) An officer, member, manager, or other responsible person shall be liable only for general excise taxes on gross income or gross proceeds collected, plus interest and penalties on those taxes, that became due during the period the person had control, supervision, responsibility, or a duty to act for the taxpayer as described in subsection (b) of this section.</w:t>
+      </w:r>
+    </w:p>
+    <w:p>
+      <w:pPr>
+        <w:pStyle w:val="XdQuote"/>
+      </w:pPr>
+      <w:r>
+        <w:t xml:space="preserve">(d) Persons liable under subsection (b) are exempt from liability when nonpayment of the general excise tax on gross income or gross proceeds held in trust is for good cause as determined by the director.</w:t>
+      </w:r>
+    </w:p>
+    <w:p>
+      <w:pPr>
+        <w:pStyle w:val="XdQuoteLast"/>
+      </w:pPr>
+      <w:r>
+        <w:t xml:space="preserve">(e) The voluntary or involuntary dissolution of the taxpayer or the withdrawal or surrender of its right to engage in business in this State shall not discharge the liability hereby imposed.</w:t>
       </w:r>
     </w:p>
     <w:p>
@@ -5338,189 +5489,7 @@
         <w:pStyle w:val="BodyText"/>
       </w:pPr>
       <w:r>
-        <w:t xml:space="preserve">An imposition of personal liability pursuant to HRS § 237</w:t>
-      </w:r>
-      <w:r>
-        <w:noBreakHyphen/>
-      </w:r>
-      <w:r>
-        <w:t xml:space="preserve">41.5,</w:t>
-      </w:r>
-      <w:r>
-        <w:t xml:space="preserve"> </w:t>
-      </w:r>
-      <w:r>
-        <w:t xml:space="preserve">however, is not an</w:t>
-      </w:r>
-      <w:r>
-        <w:t xml:space="preserve"> </w:t>
-      </w:r>
-      <w:r>
-        <w:t xml:space="preserve">“assessment.”</w:t>
-      </w:r>
-      <w:r>
-        <w:t xml:space="preserve"> </w:t>
-      </w:r>
-      <w:r>
-        <w:t xml:space="preserve">HRS § 237</w:t>
-      </w:r>
-      <w:r>
-        <w:noBreakHyphen/>
-      </w:r>
-      <w:r>
-        <w:t xml:space="preserve">41.5</w:t>
-      </w:r>
-      <w:r>
-        <w:t xml:space="preserve"> </w:t>
-      </w:r>
-      <w:r>
-        <w:t xml:space="preserve">provides:</w:t>
-      </w:r>
-    </w:p>
-    <w:p>
-      <w:pPr>
-        <w:pStyle w:val="XdQuoteFirst"/>
-      </w:pPr>
-      <w:r>
-        <w:t xml:space="preserve">(a) There shall be personal liability for the taxes imposed under this chapter as provided in this section for the following amounts of gross income or gross proceeds:</w:t>
-      </w:r>
-    </w:p>
-    <w:p>
-      <w:pPr>
-        <w:pStyle w:val="XdQuote"/>
-      </w:pPr>
-      <w:r>
-        <w:t xml:space="preserve">(1) Any amount collected as a recovery of the taxpayer’s liability under this chapter, where the amount is passed on as the tax owed by the taxpayer under this chapter for the transaction and is separately stated or accounted for in a receipt, contract, invoice, billing, or other evidence of the business activity; or</w:t>
-      </w:r>
-    </w:p>
-    <w:p>
-      <w:pPr>
-        <w:pStyle w:val="XdQuote"/>
-      </w:pPr>
-      <w:r>
-        <w:t xml:space="preserve">(2) An amount equal to the tax liability under this chapter on a transaction where a taxpayer does not separately state or account for the amount as a tax recovery as provided in paragraph (1). For purposes of this paragraph, the amount of the imputed tax liability is the result of multiplying the gross income or gross proceeds received in the transaction by the tax rate.</w:t>
-      </w:r>
-    </w:p>
-    <w:p>
-      <w:pPr>
-        <w:pStyle w:val="XdQuote"/>
-      </w:pPr>
-      <w:r>
-        <w:t xml:space="preserve">The amounts under paragraphs (1) and (2) shall be held in trust for the benefit of the State and for payment to the State in the manner and at the time required by this chapter.</w:t>
-      </w:r>
-    </w:p>
-    <w:p>
-      <w:pPr>
-        <w:pStyle w:val="XdQuote"/>
-      </w:pPr>
-      <w:r>
-        <w:t xml:space="preserve">(b) The personal liability under this section applies to any officer, member, manager, or other person having control or supervision over amounts of gross proceeds or gross income collected to pay the general excise tax and held in trust under subsection (a), or who is charged with the responsibility for the filing of returns or the payment of general excise tax on gross income or gross proceeds collected and held in trust under subsection (a). The person shall be personally liable for any unpaid taxes and interest and penalties on those taxes, if such officer or other person wilfully fails to pay or to cause to be paid any taxes due from the taxpayer pursuant to this chapter.</w:t>
-      </w:r>
-    </w:p>
-    <w:p>
-      <w:pPr>
-        <w:pStyle w:val="XdQuote"/>
-      </w:pPr>
-      <w:r>
-        <w:t xml:space="preserve">This subsection shall not apply to any officer, manager, or other person having control or supervision over amounts of gross proceeds or gross income collected to pay the general excise tax and held in trust under subsection (a), or who is charged with the responsibility for the filing of returns or the payment of general excise tax on gross income or gross proceeds collected and held in trust under subsection (a) for a nonprofit organization.</w:t>
-      </w:r>
-    </w:p>
-    <w:p>
-      <w:pPr>
-        <w:pStyle w:val="XdQuote"/>
-      </w:pPr>
-      <w:r>
-        <w:t xml:space="preserve">For purposes of this subsection:</w:t>
-      </w:r>
-    </w:p>
-    <w:p>
-      <w:pPr>
-        <w:pStyle w:val="XdQuote"/>
-      </w:pPr>
-      <w:r>
-        <w:t xml:space="preserve">“Nonprofit organization”</w:t>
-      </w:r>
-      <w:r>
-        <w:t xml:space="preserve"> </w:t>
-      </w:r>
-      <w:r>
-        <w:t xml:space="preserve">means a corporate entity, association, or other duly chartered entity that is registered with the State and is exempt from the application of this chapter pursuant to section 237</w:t>
-      </w:r>
-      <w:r>
-        <w:noBreakHyphen/>
-      </w:r>
-      <w:r>
-        <w:t xml:space="preserve">23(a)⁠(3),</w:t>
-      </w:r>
-      <w:r>
-        <w:t xml:space="preserve"> </w:t>
-      </w:r>
-      <w:r>
-        <w:t xml:space="preserve">(4), (5), (6), or (7).</w:t>
-      </w:r>
-    </w:p>
-    <w:p>
-      <w:pPr>
-        <w:pStyle w:val="XdQuote"/>
-      </w:pPr>
-      <w:r>
-        <w:t xml:space="preserve">“Wilfully fails to pay or to cause to be paid”</w:t>
-      </w:r>
-      <w:r>
-        <w:t xml:space="preserve"> </w:t>
-      </w:r>
-      <w:r>
-        <w:t xml:space="preserve">shall be construed in accordance with judicial interpretations given to similar provisions of the Internal Revenue Code; consistent therewith, the term</w:t>
-      </w:r>
-      <w:r>
-        <w:t xml:space="preserve"> </w:t>
-      </w:r>
-      <w:r>
-        <w:t xml:space="preserve">“wilfully”</w:t>
-      </w:r>
-      <w:r>
-        <w:t xml:space="preserve"> </w:t>
-      </w:r>
-      <w:r>
-        <w:t xml:space="preserve">shall mean a voluntary, intentional violation of a known legal duty.</w:t>
-      </w:r>
-    </w:p>
-    <w:p>
-      <w:pPr>
-        <w:pStyle w:val="XdQuote"/>
-      </w:pPr>
-      <w:r>
-        <w:t xml:space="preserve">(c) An officer, member, manager, or other responsible person shall be liable only for general excise taxes on gross income or gross proceeds collected, plus interest and penalties on those taxes, that became due during the period the person had control, supervision, responsibility, or a duty to act for the taxpayer as described in subsection (b) of this section.</w:t>
-      </w:r>
-    </w:p>
-    <w:p>
-      <w:pPr>
-        <w:pStyle w:val="XdQuote"/>
-      </w:pPr>
-      <w:r>
-        <w:t xml:space="preserve">(d) Persons liable under subsection (b) are exempt from liability when nonpayment of the general excise tax on gross income or gross proceeds held in trust is for good cause as determined by the director.</w:t>
-      </w:r>
-    </w:p>
-    <w:p>
-      <w:pPr>
-        <w:pStyle w:val="XdQuoteLast"/>
-      </w:pPr>
-      <w:r>
-        <w:t xml:space="preserve">(e) The voluntary or involuntary dissolution of the taxpayer or the withdrawal or surrender of its right to engage in business in this State shall not discharge the liability hereby imposed.</w:t>
-      </w:r>
-    </w:p>
-    <w:p>
-      <w:pPr>
-        <w:pStyle w:val="BodyText"/>
-      </w:pPr>
-      <w:r>
-        <w:t xml:space="preserve">HRS § 237</w:t>
-      </w:r>
-      <w:r>
-        <w:noBreakHyphen/>
-      </w:r>
-      <w:r>
-        <w:t xml:space="preserve">41.5.</w:t>
+        <w:t xml:space="preserve">HRS § 237-⁠41.5.</w:t>
       </w:r>
     </w:p>
     <w:p>
@@ -5541,6 +5510,12 @@
         <w:t xml:space="preserve">1.</w:t>
       </w:r>
       <w:r>
+        <w:rPr>
+          <w:b/>
+          <w:bCs/>
+          <w:i/>
+          <w:iCs/>
+        </w:rPr>
         <w:tab/>
       </w:r>
       <w:r>
@@ -6146,13 +6121,7 @@
         <w:footnoteReference w:id="10"/>
       </w:r>
       <w:r>
-        <w:t xml:space="preserve">, an imposition of personal liability pursuant to HRS § 237</w:t>
-      </w:r>
-      <w:r>
-        <w:noBreakHyphen/>
-      </w:r>
-      <w:r>
-        <w:t xml:space="preserve">41.5</w:t>
+        <w:t xml:space="preserve">, an imposition of personal liability pursuant to HRS § 237-⁠41.5</w:t>
       </w:r>
       <w:r>
         <w:t xml:space="preserve"> </w:t>
@@ -6185,13 +6154,7 @@
         <w:pStyle w:val="BodyText"/>
       </w:pPr>
       <w:r>
-        <w:t xml:space="preserve">At the time an imposition of personal liability against a third party pursuant to HRS § 237</w:t>
-      </w:r>
-      <w:r>
-        <w:noBreakHyphen/>
-      </w:r>
-      <w:r>
-        <w:t xml:space="preserve">41.5</w:t>
+        <w:t xml:space="preserve">At the time an imposition of personal liability against a third party pursuant to HRS § 237-⁠41.5</w:t>
       </w:r>
       <w:r>
         <w:t xml:space="preserve"> </w:t>
@@ -6203,7 +6166,7 @@
         <w:t xml:space="preserve"> </w:t>
       </w:r>
       <w:r>
-        <w:t xml:space="preserve">“wilfully fail[ ]”</w:t>
+        <w:t xml:space="preserve">“wilfully fail[ ]”</w:t>
       </w:r>
       <w:r>
         <w:t xml:space="preserve"> </w:t>
@@ -6225,13 +6188,7 @@
         <w:t xml:space="preserve"> </w:t>
       </w:r>
       <w:r>
-        <w:t xml:space="preserve">HRS § 237</w:t>
-      </w:r>
-      <w:r>
-        <w:noBreakHyphen/>
-      </w:r>
-      <w:r>
-        <w:t xml:space="preserve">41.5(b)</w:t>
+        <w:t xml:space="preserve">HRS § 237-⁠41.5(b)</w:t>
       </w:r>
       <w:r>
         <w:t xml:space="preserve"> </w:t>
@@ -6261,13 +6218,7 @@
         <w:pStyle w:val="BodyText"/>
       </w:pPr>
       <w:r>
-        <w:t xml:space="preserve">Accordingly, an imposition of personal liability under HRS § 237</w:t>
-      </w:r>
-      <w:r>
-        <w:noBreakHyphen/>
-      </w:r>
-      <w:r>
-        <w:t xml:space="preserve">41.5</w:t>
+        <w:t xml:space="preserve">Accordingly, an imposition of personal liability under HRS § 237-⁠41.5</w:t>
       </w:r>
       <w:r>
         <w:t xml:space="preserve"> </w:t>
@@ -6294,6 +6245,12 @@
         <w:t xml:space="preserve">2.</w:t>
       </w:r>
       <w:r>
+        <w:rPr>
+          <w:b/>
+          <w:bCs/>
+          <w:i/>
+          <w:iCs/>
+        </w:rPr>
         <w:tab/>
       </w:r>
       <w:r>
@@ -6769,617 +6726,449 @@
         <w:t xml:space="preserve"> </w:t>
       </w:r>
       <w:r>
-        <w:t xml:space="preserve">HRS § 237</w:t>
+        <w:t xml:space="preserve">HRS § 237-⁠36.</w:t>
+      </w:r>
+    </w:p>
+    <w:p>
+      <w:pPr>
+        <w:pStyle w:val="BodyText"/>
+      </w:pPr>
+      <w:r>
+        <w:t xml:space="preserve">(2) If</w:t>
+      </w:r>
+      <w:r>
+        <w:t xml:space="preserve"> </w:t>
+      </w:r>
+      <w:r>
+        <w:t xml:space="preserve">“any person fails, neglects, or refuses to make a return.”</w:t>
+      </w:r>
+      <w:r>
+        <w:t xml:space="preserve"> </w:t>
+      </w:r>
+      <w:r>
+        <w:t xml:space="preserve">HRS § 237-⁠38.</w:t>
+      </w:r>
+    </w:p>
+    <w:p>
+      <w:pPr>
+        <w:pStyle w:val="BodyText"/>
+      </w:pPr>
+      <w:r>
+        <w:t xml:space="preserve">(3) If, upon audit, DOTAX</w:t>
+      </w:r>
+      <w:r>
+        <w:t xml:space="preserve"> </w:t>
+      </w:r>
+      <w:r>
+        <w:t xml:space="preserve">“determines that any gross income or gross proceeds of sales liable to the tax have not been assessed.”</w:t>
+      </w:r>
+      <w:r>
+        <w:t xml:space="preserve"> </w:t>
+      </w:r>
+      <w:r>
+        <w:t xml:space="preserve">HRS § 237-⁠39.</w:t>
+      </w:r>
+    </w:p>
+    <w:p>
+      <w:pPr>
+        <w:pStyle w:val="BodyText"/>
+      </w:pPr>
+      <w:r>
+        <w:t xml:space="preserve">In contrast, HRS § 237-⁠41.5</w:t>
+      </w:r>
+      <w:r>
+        <w:t xml:space="preserve"> </w:t>
+      </w:r>
+      <w:r>
+        <w:t xml:space="preserve">does not authorize DOTAX to issue an</w:t>
+      </w:r>
+      <w:r>
+        <w:t xml:space="preserve"> </w:t>
+      </w:r>
+      <w:r>
+        <w:t xml:space="preserve">“assessment,”</w:t>
+      </w:r>
+      <w:r>
+        <w:t xml:space="preserve"> </w:t>
+      </w:r>
+      <w:r>
+        <w:t xml:space="preserve">but rather, only authorizes DOTAX to impose personal liability on certain third parties when a tax debt owed by the taxpayer, for which the third party is an officer, member, manager, or other responsible person, has not been paid. HRS § 237-⁠41.5.</w:t>
+      </w:r>
+      <w:r>
+        <w:t xml:space="preserve"> </w:t>
+      </w:r>
+      <w:r>
+        <w:t xml:space="preserve">Notably, there are other provisions in the HRS that, like HRS § 237-⁠41.5,</w:t>
+      </w:r>
+      <w:r>
+        <w:t xml:space="preserve"> </w:t>
+      </w:r>
+      <w:r>
+        <w:t xml:space="preserve">relate to an imposition of liability on a third party for the taxes owed by another. Those provisions, unlike HRS § 237-⁠41.5,</w:t>
+      </w:r>
+      <w:r>
+        <w:t xml:space="preserve"> </w:t>
+      </w:r>
+      <w:r>
+        <w:t xml:space="preserve">contain express language that either authorizes the third party to appeal to the Tax Appeal Court as if the third party received an assessment or authorizes DOTAX to issue an assessment to the third party.</w:t>
+      </w:r>
+    </w:p>
+    <w:p>
+      <w:pPr>
+        <w:pStyle w:val="BodyText"/>
+      </w:pPr>
+      <w:r>
+        <w:t xml:space="preserve">For example, HRS § 232-⁠1</w:t>
+      </w:r>
+      <w:r>
+        <w:t xml:space="preserve"> </w:t>
+      </w:r>
+      <w:r>
+        <w:t xml:space="preserve">provides that a person</w:t>
+      </w:r>
+      <w:r>
+        <w:t xml:space="preserve"> </w:t>
+      </w:r>
+      <w:r>
+        <w:t xml:space="preserve">“under a contractual obligation to pay a tax assessed against another . . . shall have the same rights of appeal to . . . the tax appeal court . . . in the person’s own name, as if the tax were assessed against the person.”</w:t>
+      </w:r>
+      <w:r>
+        <w:t xml:space="preserve"> </w:t>
+      </w:r>
+      <w:r>
+        <w:t xml:space="preserve">HRS § 232-⁠1</w:t>
+      </w:r>
+      <w:r>
+        <w:t xml:space="preserve"> </w:t>
+      </w:r>
+      <w:r>
+        <w:t xml:space="preserve">(emphasis added). The fact that the legislature affirmatively provided a right to appeal in HRS § 232-⁠1</w:t>
+      </w:r>
+      <w:r>
+        <w:t xml:space="preserve"> </w:t>
+      </w:r>
+      <w:r>
+        <w:t xml:space="preserve">“as if the tax were assessed against the person”</w:t>
+      </w:r>
+      <w:r>
+        <w:t xml:space="preserve"> </w:t>
+      </w:r>
+      <w:r>
+        <w:t xml:space="preserve">indicates that the person would not have otherwise received an assessment and would not have been able to appeal under HRS § 237-⁠42.</w:t>
+      </w:r>
+    </w:p>
+    <w:p>
+      <w:pPr>
+        <w:pStyle w:val="BodyText"/>
+      </w:pPr>
+      <w:r>
+        <w:t xml:space="preserve">As a further example, HRS § 235-⁠64(b)</w:t>
+      </w:r>
+      <w:r>
+        <w:t xml:space="preserve"> </w:t>
+      </w:r>
+      <w:r>
+        <w:t xml:space="preserve">imposes personal liability on persons who are under a duty to withhold income taxes from the wages of employees, but who wilfully fail to do so. HRS § 235-⁠64(b)</w:t>
+      </w:r>
+      <w:r>
+        <w:t xml:space="preserve"> </w:t>
+      </w:r>
+      <w:r>
+        <w:t xml:space="preserve">provides that the</w:t>
+      </w:r>
+      <w:r>
+        <w:t xml:space="preserve"> </w:t>
+      </w:r>
+      <w:r>
+        <w:t xml:space="preserve">“liability may be assessed and collected in the same manner as the liability [against employers] imposed by subsection (a).”</w:t>
+      </w:r>
+      <w:r>
+        <w:t xml:space="preserve"> </w:t>
+      </w:r>
+      <w:r>
+        <w:t xml:space="preserve">HRS § 235-⁠64(b)</w:t>
+      </w:r>
+      <w:r>
+        <w:t xml:space="preserve"> </w:t>
+      </w:r>
+      <w:r>
+        <w:t xml:space="preserve">(emphasis added).</w:t>
+      </w:r>
+    </w:p>
+    <w:p>
+      <w:pPr>
+        <w:pStyle w:val="BodyText"/>
+      </w:pPr>
+      <w:r>
+        <w:t xml:space="preserve">The liability imposed under HRS § 235-⁠64(b),</w:t>
+      </w:r>
+      <w:r>
+        <w:t xml:space="preserve"> </w:t>
+      </w:r>
+      <w:r>
+        <w:t xml:space="preserve">which may apply to individuals (except those who have ministerial duties) who are responsible for withholding, is separate from the liability imposed on</w:t>
+      </w:r>
+      <w:r>
+        <w:t xml:space="preserve"> </w:t>
+      </w:r>
+      <w:r>
+        <w:t xml:space="preserve">“employers”</w:t>
+      </w:r>
+      <w:r>
+        <w:t xml:space="preserve"> </w:t>
+      </w:r>
+      <w:r>
+        <w:t xml:space="preserve">under HRS § 235-⁠64(a)</w:t>
+      </w:r>
+      <w:r>
+        <w:t xml:space="preserve"> </w:t>
+      </w:r>
+      <w:r>
+        <w:t xml:space="preserve">who fail to withhold or pay income taxes from the wages of employees. HRS § 235-⁠64.</w:t>
+      </w:r>
+      <w:r>
+        <w:t xml:space="preserve"> </w:t>
+      </w:r>
+      <w:r>
+        <w:t xml:space="preserve">For purposes of the withholding of income taxes, employers are treated as the taxpayers. Thus, DOTAX is authorized by statute to assess an</w:t>
+      </w:r>
+      <w:r>
+        <w:t xml:space="preserve"> </w:t>
+      </w:r>
+      <w:r>
+        <w:t xml:space="preserve">“employer”</w:t>
+      </w:r>
+      <w:r>
+        <w:t xml:space="preserve"> </w:t>
+      </w:r>
+      <w:r>
+        <w:t xml:space="preserve">for the failure to withhold and pay income taxes. HRS § 235-⁠108(b)</w:t>
+      </w:r>
+      <w:r>
+        <w:t xml:space="preserve"> </w:t>
+      </w:r>
+      <w:r>
+        <w:t xml:space="preserve">(</w:t>
+      </w:r>
+      <w:r>
+        <w:t xml:space="preserve">“[i]f the department of taxation discovers . . . that . . . the liability of an employer in respect of wages, or any portion thereof, has not been assessed, it may assess the same and give notice to the . . . employer of the assessment”</w:t>
+      </w:r>
+      <w:r>
+        <w:t xml:space="preserve">). Further, an</w:t>
+      </w:r>
+      <w:r>
+        <w:t xml:space="preserve"> </w:t>
+      </w:r>
+      <w:r>
+        <w:t xml:space="preserve">“employer”</w:t>
+      </w:r>
+      <w:r>
+        <w:t xml:space="preserve"> </w:t>
+      </w:r>
+      <w:r>
+        <w:t xml:space="preserve">is expressly permitted to appeal to the Tax Appeal Court from an assessment. HRS § 235-⁠114</w:t>
+      </w:r>
+      <w:r>
+        <w:t xml:space="preserve"> </w:t>
+      </w:r>
+      <w:r>
+        <w:t xml:space="preserve">(any</w:t>
+      </w:r>
+      <w:r>
+        <w:t xml:space="preserve"> </w:t>
+      </w:r>
+      <w:r>
+        <w:t xml:space="preserve">“employer appealing from any assessment . . . shall lodge with the assessor . . . a notice of the appeal”</w:t>
+      </w:r>
+      <w:r>
+        <w:t xml:space="preserve">).</w:t>
+      </w:r>
+    </w:p>
+    <w:p>
+      <w:pPr>
+        <w:pStyle w:val="BodyText"/>
+      </w:pPr>
+      <w:r>
+        <w:t xml:space="preserve">HRS § 235-⁠64(b)</w:t>
+      </w:r>
+      <w:r>
+        <w:t xml:space="preserve"> </w:t>
+      </w:r>
+      <w:r>
+        <w:t xml:space="preserve">therefore imposes liability on persons under a duty to withhold income taxes and also authorizes DOTAX to issue assessments against those persons. The fact that the legislature, in HRS § 235-⁠64(b),</w:t>
+      </w:r>
+      <w:r>
+        <w:t xml:space="preserve"> </w:t>
+      </w:r>
+      <w:r>
+        <w:t xml:space="preserve">affirmatively provided DOTAX with the ability to assess the person being held personally liable</w:t>
+      </w:r>
+      <w:r>
+        <w:t xml:space="preserve"> </w:t>
+      </w:r>
+      <w:r>
+        <w:t xml:space="preserve">“in the same manner”</w:t>
+      </w:r>
+      <w:r>
+        <w:t xml:space="preserve"> </w:t>
+      </w:r>
+      <w:r>
+        <w:t xml:space="preserve">that employers may be assessed indicates that the person would not have otherwise received an assessment, and therefore, would not have been able to appeal the assessment under HRS § 235-⁠114.</w:t>
+      </w:r>
+    </w:p>
+    <w:p>
+      <w:pPr>
+        <w:pStyle w:val="BodyText"/>
+      </w:pPr>
+      <w:r>
+        <w:t xml:space="preserve">Thus, while HRS § 232-⁠1</w:t>
+      </w:r>
+      <w:r>
+        <w:t xml:space="preserve"> </w:t>
+      </w:r>
+      <w:r>
+        <w:t xml:space="preserve">and HRS § 235-⁠64</w:t>
+      </w:r>
+      <w:r>
+        <w:t xml:space="preserve"> </w:t>
+      </w:r>
+      <w:r>
+        <w:t xml:space="preserve">expressly contain language that either authorizes a third party who is liable for the tax of another to appeal to the Tax Appeal Court or authorizes DOTAX to issue an assessment to the third party, HRS § 237-⁠41.5,</w:t>
+      </w:r>
+      <w:r>
+        <w:t xml:space="preserve"> </w:t>
+      </w:r>
+      <w:r>
+        <w:t xml:space="preserve">by contrast, contains no such provision. Under rules of statutory construction, it must be presumed that the omission of language in HRS § 237-⁠41.5</w:t>
+      </w:r>
+      <w:r>
+        <w:t xml:space="preserve"> </w:t>
+      </w:r>
+      <w:r>
+        <w:t xml:space="preserve">authorizing an appeal or authorizing DOTAX to issue an assessment was intentional.</w:t>
+      </w:r>
+      <w:r>
+        <w:t xml:space="preserve"> </w:t>
+      </w:r>
+      <w:r>
+        <w:rPr>
+          <w:i/>
+          <w:iCs/>
+        </w:rPr>
+        <w:t xml:space="preserve">See</w:t>
+      </w:r>
+      <w:r>
+        <w:t xml:space="preserve"> </w:t>
+      </w:r>
+      <w:r>
+        <w:rPr>
+          <w:i/>
+          <w:iCs/>
+        </w:rPr>
+        <w:t xml:space="preserve">In re Water Use Permit</w:t>
+      </w:r>
+      <w:r>
+        <w:rPr>
+          <w:i/>
+          <w:iCs/>
+        </w:rPr>
+        <w:t xml:space="preserve"> </w:t>
+      </w:r>
+      <w:r>
+        <w:rPr>
+          <w:i/>
+          <w:iCs/>
+        </w:rPr>
+        <w:t xml:space="preserve">Applications</w:t>
+      </w:r>
+      <w:r>
+        <w:t xml:space="preserve">, 94 Hawaii 97, 151 (2000) (</w:t>
+      </w:r>
+      <w:r>
+        <w:t xml:space="preserve">“[w]here [the legislature] includes particular language in one section of a statute but omits it in another section of the same Act, it is generally presumed that [the legislature] acts intentionally and purposely in the disparate inclusion or exclusion”</w:t>
+      </w:r>
+      <w:r>
+        <w:t xml:space="preserve">).</w:t>
+      </w:r>
+    </w:p>
+    <w:p>
+      <w:pPr>
+        <w:pStyle w:val="BodyText"/>
+      </w:pPr>
+      <w:r>
+        <w:t xml:space="preserve">Based on the foregoing, an imposition of personal liability pursuant to HRS § 237-⁠41.5</w:t>
+      </w:r>
+      <w:r>
+        <w:t xml:space="preserve"> </w:t>
+      </w:r>
+      <w:r>
+        <w:t xml:space="preserve">is not appealable as an</w:t>
+      </w:r>
+      <w:r>
+        <w:t xml:space="preserve"> </w:t>
+      </w:r>
+      <w:r>
+        <w:t xml:space="preserve">“assessment”</w:t>
+      </w:r>
+      <w:r>
+        <w:t xml:space="preserve"> </w:t>
+      </w:r>
+      <w:r>
+        <w:t xml:space="preserve">because: (1) it is a</w:t>
+      </w:r>
+      <w:r>
+        <w:t xml:space="preserve"> </w:t>
+      </w:r>
+      <w:r>
+        <w:t xml:space="preserve">“separate step in the taxation process from assessment”</w:t>
+      </w:r>
+      <w:r>
+        <w:t xml:space="preserve"> </w:t>
+      </w:r>
+      <w:r>
+        <w:t xml:space="preserve">that occurs as a means of collection after a tax debt has been established and has gone unpaid; (2) none of the circumstances under HRS §§ 237-⁠36,</w:t>
+      </w:r>
+      <w:r>
+        <w:t xml:space="preserve"> </w:t>
+      </w:r>
+      <w:r>
+        <w:t xml:space="preserve">237</w:t>
       </w:r>
       <w:r>
         <w:noBreakHyphen/>
       </w:r>
       <w:r>
-        <w:t xml:space="preserve">36.</w:t>
-      </w:r>
-    </w:p>
-    <w:p>
-      <w:pPr>
-        <w:pStyle w:val="BodyText"/>
-      </w:pPr>
-      <w:r>
-        <w:t xml:space="preserve">(2) If</w:t>
-      </w:r>
-      <w:r>
-        <w:t xml:space="preserve"> </w:t>
-      </w:r>
-      <w:r>
-        <w:t xml:space="preserve">“any person fails, neglects, or refuses to make a return.”</w:t>
-      </w:r>
-      <w:r>
-        <w:t xml:space="preserve"> </w:t>
-      </w:r>
-      <w:r>
-        <w:t xml:space="preserve">HRS § 237</w:t>
+        <w:t xml:space="preserve">38,</w:t>
+      </w:r>
+      <w:r>
+        <w:t xml:space="preserve"> </w:t>
+      </w:r>
+      <w:r>
+        <w:t xml:space="preserve">or 237</w:t>
       </w:r>
       <w:r>
         <w:noBreakHyphen/>
       </w:r>
       <w:r>
-        <w:t xml:space="preserve">38.</w:t>
-      </w:r>
-    </w:p>
-    <w:p>
-      <w:pPr>
-        <w:pStyle w:val="BodyText"/>
-      </w:pPr>
-      <w:r>
-        <w:t xml:space="preserve">(3) If, upon audit, DOTAX</w:t>
-      </w:r>
-      <w:r>
-        <w:t xml:space="preserve"> </w:t>
-      </w:r>
-      <w:r>
-        <w:t xml:space="preserve">“determines that any gross income or gross proceeds of sales liable to the tax have not been assessed.”</w:t>
-      </w:r>
-      <w:r>
-        <w:t xml:space="preserve"> </w:t>
-      </w:r>
-      <w:r>
-        <w:t xml:space="preserve">HRS § 237</w:t>
-      </w:r>
-      <w:r>
-        <w:noBreakHyphen/>
-      </w:r>
-      <w:r>
-        <w:t xml:space="preserve">39.</w:t>
-      </w:r>
-    </w:p>
-    <w:p>
-      <w:pPr>
-        <w:pStyle w:val="BodyText"/>
-      </w:pPr>
-      <w:r>
-        <w:t xml:space="preserve">In contrast, HRS § 237</w:t>
-      </w:r>
-      <w:r>
-        <w:noBreakHyphen/>
-      </w:r>
-      <w:r>
-        <w:t xml:space="preserve">41.5</w:t>
-      </w:r>
-      <w:r>
-        <w:t xml:space="preserve"> </w:t>
-      </w:r>
-      <w:r>
-        <w:t xml:space="preserve">does not authorize DOTAX to issue an</w:t>
-      </w:r>
-      <w:r>
-        <w:t xml:space="preserve"> </w:t>
-      </w:r>
-      <w:r>
-        <w:t xml:space="preserve">“assessment,”</w:t>
-      </w:r>
-      <w:r>
-        <w:t xml:space="preserve"> </w:t>
-      </w:r>
-      <w:r>
-        <w:t xml:space="preserve">but rather, only authorizes DOTAX to impose personal liability on certain third parties when a tax debt owed by the taxpayer, for which the third party is an officer, member, manager, or other responsible person, has not been paid. HRS § 237</w:t>
-      </w:r>
-      <w:r>
-        <w:noBreakHyphen/>
-      </w:r>
-      <w:r>
-        <w:t xml:space="preserve">41.5.</w:t>
-      </w:r>
-      <w:r>
-        <w:t xml:space="preserve"> </w:t>
-      </w:r>
-      <w:r>
-        <w:t xml:space="preserve">Notably, there are other provisions in the HRS that, like HRS § 237</w:t>
-      </w:r>
-      <w:r>
-        <w:noBreakHyphen/>
-      </w:r>
-      <w:r>
-        <w:t xml:space="preserve">41.5,</w:t>
-      </w:r>
-      <w:r>
-        <w:t xml:space="preserve"> </w:t>
-      </w:r>
-      <w:r>
-        <w:t xml:space="preserve">relate to an imposition of liability on a third party for the taxes owed by another. Those provisions, unlike HRS § 237</w:t>
-      </w:r>
-      <w:r>
-        <w:noBreakHyphen/>
-      </w:r>
-      <w:r>
-        <w:t xml:space="preserve">41.5,</w:t>
-      </w:r>
-      <w:r>
-        <w:t xml:space="preserve"> </w:t>
-      </w:r>
-      <w:r>
-        <w:t xml:space="preserve">contain express language that either authorizes the third party to appeal to the Tax Appeal Court as if the third party received an assessment or authorizes DOTAX to issue an assessment to the third party.</w:t>
-      </w:r>
-    </w:p>
-    <w:p>
-      <w:pPr>
-        <w:pStyle w:val="BodyText"/>
-      </w:pPr>
-      <w:r>
-        <w:t xml:space="preserve">For example, HRS § 232</w:t>
-      </w:r>
-      <w:r>
-        <w:noBreakHyphen/>
-      </w:r>
-      <w:r>
-        <w:t xml:space="preserve">1 provides that a person</w:t>
-      </w:r>
-      <w:r>
-        <w:t xml:space="preserve"> </w:t>
-      </w:r>
-      <w:r>
-        <w:t xml:space="preserve">“under a contractual obligation to pay a tax assessed against another . . . shall have the same rights of appeal to . . . the tax appeal court . . . in the person’s own name, as if the tax were assessed against the person.”</w:t>
-      </w:r>
-      <w:r>
-        <w:t xml:space="preserve"> </w:t>
-      </w:r>
-      <w:r>
-        <w:t xml:space="preserve">HRS § 232</w:t>
-      </w:r>
-      <w:r>
-        <w:noBreakHyphen/>
-      </w:r>
-      <w:r>
-        <w:t xml:space="preserve">1 (emphasis added). The fact that the legislature affirmatively provided a right to appeal in HRS § 232</w:t>
-      </w:r>
-      <w:r>
-        <w:noBreakHyphen/>
-      </w:r>
-      <w:r>
-        <w:t xml:space="preserve">1</w:t>
-      </w:r>
-      <w:r>
-        <w:t xml:space="preserve"> </w:t>
-      </w:r>
-      <w:r>
-        <w:t xml:space="preserve">“as if the tax were assessed against the person”</w:t>
-      </w:r>
-      <w:r>
-        <w:t xml:space="preserve"> </w:t>
-      </w:r>
-      <w:r>
-        <w:t xml:space="preserve">indicates that the person would not have otherwise received an assessment and would not have been able to appeal under HRS § 237</w:t>
-      </w:r>
-      <w:r>
-        <w:noBreakHyphen/>
-      </w:r>
-      <w:r>
-        <w:t xml:space="preserve">42.</w:t>
-      </w:r>
-    </w:p>
-    <w:p>
-      <w:pPr>
-        <w:pStyle w:val="BodyText"/>
-      </w:pPr>
-      <w:r>
-        <w:t xml:space="preserve">As a further example, HRS § 235</w:t>
-      </w:r>
-      <w:r>
-        <w:noBreakHyphen/>
-      </w:r>
-      <w:r>
-        <w:t xml:space="preserve">64(b)</w:t>
-      </w:r>
-      <w:r>
-        <w:t xml:space="preserve"> </w:t>
-      </w:r>
-      <w:r>
-        <w:t xml:space="preserve">imposes personal liability on persons who are under a duty to withhold income taxes from the wages of employees, but who wilfully fail to do so. HRS § 235</w:t>
-      </w:r>
-      <w:r>
-        <w:noBreakHyphen/>
-      </w:r>
-      <w:r>
-        <w:t xml:space="preserve">64(b)</w:t>
-      </w:r>
-      <w:r>
-        <w:t xml:space="preserve"> </w:t>
-      </w:r>
-      <w:r>
-        <w:t xml:space="preserve">provides that the</w:t>
-      </w:r>
-      <w:r>
-        <w:t xml:space="preserve"> </w:t>
-      </w:r>
-      <w:r>
-        <w:t xml:space="preserve">“liability may be assessed and collected in the same manner as the liability [against employers] imposed by subsection (a).”</w:t>
-      </w:r>
-      <w:r>
-        <w:t xml:space="preserve"> </w:t>
-      </w:r>
-      <w:r>
-        <w:t xml:space="preserve">HRS § 235</w:t>
-      </w:r>
-      <w:r>
-        <w:noBreakHyphen/>
-      </w:r>
-      <w:r>
-        <w:t xml:space="preserve">64(b)</w:t>
-      </w:r>
-      <w:r>
-        <w:t xml:space="preserve"> </w:t>
-      </w:r>
-      <w:r>
-        <w:t xml:space="preserve">(emphasis added).</w:t>
-      </w:r>
-    </w:p>
-    <w:p>
-      <w:pPr>
-        <w:pStyle w:val="BodyText"/>
-      </w:pPr>
-      <w:r>
-        <w:t xml:space="preserve">The liability imposed under HRS § 235</w:t>
-      </w:r>
-      <w:r>
-        <w:noBreakHyphen/>
-      </w:r>
-      <w:r>
-        <w:t xml:space="preserve">64(b),</w:t>
-      </w:r>
-      <w:r>
-        <w:t xml:space="preserve"> </w:t>
-      </w:r>
-      <w:r>
-        <w:t xml:space="preserve">which may apply to individuals (except those who have ministerial duties) who are responsible for withholding, is separate from the liability imposed on</w:t>
-      </w:r>
-      <w:r>
-        <w:t xml:space="preserve"> </w:t>
-      </w:r>
-      <w:r>
-        <w:t xml:space="preserve">“employers”</w:t>
-      </w:r>
-      <w:r>
-        <w:t xml:space="preserve"> </w:t>
-      </w:r>
-      <w:r>
-        <w:t xml:space="preserve">under HRS § 235</w:t>
-      </w:r>
-      <w:r>
-        <w:noBreakHyphen/>
-      </w:r>
-      <w:r>
-        <w:t xml:space="preserve">64(a)</w:t>
-      </w:r>
-      <w:r>
-        <w:t xml:space="preserve"> </w:t>
-      </w:r>
-      <w:r>
-        <w:t xml:space="preserve">who fail to withhold or pay income taxes from the wages of employees. HRS § 235</w:t>
-      </w:r>
-      <w:r>
-        <w:noBreakHyphen/>
-      </w:r>
-      <w:r>
-        <w:t xml:space="preserve">64.</w:t>
-      </w:r>
-      <w:r>
-        <w:t xml:space="preserve"> </w:t>
-      </w:r>
-      <w:r>
-        <w:t xml:space="preserve">For purposes of the withholding of income taxes, employers are treated as the taxpayers. Thus, DOTAX is authorized by statute to assess an</w:t>
-      </w:r>
-      <w:r>
-        <w:t xml:space="preserve"> </w:t>
-      </w:r>
-      <w:r>
-        <w:t xml:space="preserve">“employer”</w:t>
-      </w:r>
-      <w:r>
-        <w:t xml:space="preserve"> </w:t>
-      </w:r>
-      <w:r>
-        <w:t xml:space="preserve">for the failure to withhold and pay income taxes. HRS § 235</w:t>
-      </w:r>
-      <w:r>
-        <w:noBreakHyphen/>
-      </w:r>
-      <w:r>
-        <w:t xml:space="preserve">108(b)</w:t>
-      </w:r>
-      <w:r>
-        <w:t xml:space="preserve"> </w:t>
-      </w:r>
-      <w:r>
-        <w:t xml:space="preserve">(</w:t>
-      </w:r>
-      <w:r>
-        <w:t xml:space="preserve">“[i]f the department of taxation discovers . . . that . . . the liability of an employer in respect of wages, or any portion thereof, has not been assessed, it may assess the same and give notice to the . . . employer of the assessment”</w:t>
-      </w:r>
-      <w:r>
-        <w:t xml:space="preserve">). Further, an</w:t>
-      </w:r>
-      <w:r>
-        <w:t xml:space="preserve"> </w:t>
-      </w:r>
-      <w:r>
-        <w:t xml:space="preserve">“employer”</w:t>
-      </w:r>
-      <w:r>
-        <w:t xml:space="preserve"> </w:t>
-      </w:r>
-      <w:r>
-        <w:t xml:space="preserve">is expressly permitted to appeal to the Tax Appeal Court from an assessment. HRS § 235</w:t>
-      </w:r>
-      <w:r>
-        <w:noBreakHyphen/>
-      </w:r>
-      <w:r>
-        <w:t xml:space="preserve">114</w:t>
-      </w:r>
-      <w:r>
-        <w:t xml:space="preserve"> </w:t>
-      </w:r>
-      <w:r>
-        <w:t xml:space="preserve">(any</w:t>
-      </w:r>
-      <w:r>
-        <w:t xml:space="preserve"> </w:t>
-      </w:r>
-      <w:r>
-        <w:t xml:space="preserve">“employer appealing from any assessment . . . shall lodge with the assessor . . . a notice of the appeal”</w:t>
-      </w:r>
-      <w:r>
-        <w:t xml:space="preserve">).</w:t>
-      </w:r>
-    </w:p>
-    <w:p>
-      <w:pPr>
-        <w:pStyle w:val="BodyText"/>
-      </w:pPr>
-      <w:r>
-        <w:t xml:space="preserve">HRS § 235</w:t>
-      </w:r>
-      <w:r>
-        <w:noBreakHyphen/>
-      </w:r>
-      <w:r>
-        <w:t xml:space="preserve">64(b)</w:t>
-      </w:r>
-      <w:r>
-        <w:t xml:space="preserve"> </w:t>
-      </w:r>
-      <w:r>
-        <w:t xml:space="preserve">therefore imposes liability on persons under a duty to withhold income taxes and also authorizes DOTAX to issue assessments against those persons. The fact that the legislature, in HRS § 235</w:t>
-      </w:r>
-      <w:r>
-        <w:noBreakHyphen/>
-      </w:r>
-      <w:r>
-        <w:t xml:space="preserve">64(b),</w:t>
-      </w:r>
-      <w:r>
-        <w:t xml:space="preserve"> </w:t>
-      </w:r>
-      <w:r>
-        <w:t xml:space="preserve">affirmatively provided DOTAX with the ability to assess the person being held personally liable</w:t>
-      </w:r>
-      <w:r>
-        <w:t xml:space="preserve"> </w:t>
-      </w:r>
-      <w:r>
-        <w:t xml:space="preserve">“in the same manner”</w:t>
-      </w:r>
-      <w:r>
-        <w:t xml:space="preserve"> </w:t>
-      </w:r>
-      <w:r>
-        <w:t xml:space="preserve">that employers may be assessed indicates that the person would not have otherwise received an assessment, and therefore, would not have been able to appeal the assessment under HRS § 235</w:t>
-      </w:r>
-      <w:r>
-        <w:noBreakHyphen/>
-      </w:r>
-      <w:r>
-        <w:t xml:space="preserve">114.</w:t>
-      </w:r>
-    </w:p>
-    <w:p>
-      <w:pPr>
-        <w:pStyle w:val="BodyText"/>
-      </w:pPr>
-      <w:r>
-        <w:t xml:space="preserve">Thus, while HRS § 232</w:t>
-      </w:r>
-      <w:r>
-        <w:noBreakHyphen/>
-      </w:r>
-      <w:r>
-        <w:t xml:space="preserve">1 and HRS § 235</w:t>
-      </w:r>
-      <w:r>
-        <w:noBreakHyphen/>
-      </w:r>
-      <w:r>
-        <w:t xml:space="preserve">64</w:t>
-      </w:r>
-      <w:r>
-        <w:t xml:space="preserve"> </w:t>
-      </w:r>
-      <w:r>
-        <w:t xml:space="preserve">expressly contain language that either authorizes a third party who is liable for the tax of another to appeal to the Tax Appeal Court or authorizes DOTAX to issue an assessment to the third party, HRS § 237</w:t>
-      </w:r>
-      <w:r>
-        <w:noBreakHyphen/>
-      </w:r>
-      <w:r>
-        <w:t xml:space="preserve">41.5,</w:t>
-      </w:r>
-      <w:r>
-        <w:t xml:space="preserve"> </w:t>
-      </w:r>
-      <w:r>
-        <w:t xml:space="preserve">by contrast, contains no such provision. Under rules of statutory construction, it must be presumed that the omission of language in HRS § 237</w:t>
-      </w:r>
-      <w:r>
-        <w:noBreakHyphen/>
-      </w:r>
-      <w:r>
-        <w:t xml:space="preserve">41.5</w:t>
-      </w:r>
-      <w:r>
-        <w:t xml:space="preserve"> </w:t>
-      </w:r>
-      <w:r>
-        <w:t xml:space="preserve">authorizing an appeal or authorizing DOTAX to issue an assessment was intentional.</w:t>
-      </w:r>
-      <w:r>
-        <w:t xml:space="preserve"> </w:t>
-      </w:r>
-      <w:r>
-        <w:rPr>
-          <w:i/>
-          <w:iCs/>
-        </w:rPr>
-        <w:t xml:space="preserve">See</w:t>
-      </w:r>
-      <w:r>
-        <w:t xml:space="preserve"> </w:t>
-      </w:r>
-      <w:r>
-        <w:rPr>
-          <w:i/>
-          <w:iCs/>
-        </w:rPr>
-        <w:t xml:space="preserve">In re Water Use Permit</w:t>
-      </w:r>
-      <w:r>
-        <w:rPr>
-          <w:i/>
-          <w:iCs/>
-        </w:rPr>
-        <w:t xml:space="preserve"> </w:t>
-      </w:r>
-      <w:r>
-        <w:rPr>
-          <w:i/>
-          <w:iCs/>
-        </w:rPr>
-        <w:t xml:space="preserve">Applications</w:t>
-      </w:r>
-      <w:r>
-        <w:t xml:space="preserve">, 94 Hawaii 97, 151 (2000) (</w:t>
-      </w:r>
-      <w:r>
-        <w:t xml:space="preserve">“[w]here [the legislature] includes particular language in one section of a statute but omits it in another section of the same Act, it is generally presumed that [the legislature] acts intentionally and purposely in the disparate inclusion or exclusion”</w:t>
-      </w:r>
-      <w:r>
-        <w:t xml:space="preserve">).</w:t>
-      </w:r>
-    </w:p>
-    <w:p>
-      <w:pPr>
-        <w:pStyle w:val="BodyText"/>
-      </w:pPr>
-      <w:r>
-        <w:t xml:space="preserve">Based on the foregoing, an imposition of personal liability pursuant to HRS § 237</w:t>
-      </w:r>
-      <w:r>
-        <w:noBreakHyphen/>
-      </w:r>
-      <w:r>
-        <w:t xml:space="preserve">41.5</w:t>
-      </w:r>
-      <w:r>
-        <w:t xml:space="preserve"> </w:t>
-      </w:r>
-      <w:r>
-        <w:t xml:space="preserve">is not appealable as an</w:t>
-      </w:r>
-      <w:r>
-        <w:t xml:space="preserve"> </w:t>
-      </w:r>
-      <w:r>
-        <w:t xml:space="preserve">“assessment”</w:t>
-      </w:r>
-      <w:r>
-        <w:t xml:space="preserve"> </w:t>
-      </w:r>
-      <w:r>
-        <w:t xml:space="preserve">because: (1) it is a</w:t>
-      </w:r>
-      <w:r>
-        <w:t xml:space="preserve"> </w:t>
-      </w:r>
-      <w:r>
-        <w:t xml:space="preserve">“separate step in the taxation process from assessment”</w:t>
-      </w:r>
-      <w:r>
-        <w:t xml:space="preserve"> </w:t>
-      </w:r>
-      <w:r>
-        <w:t xml:space="preserve">that occurs as a means of collection after a tax debt has been established and has gone unpaid; (2) none of the circumstances under HRS §§ 237</w:t>
-      </w:r>
-      <w:r>
-        <w:noBreakHyphen/>
-      </w:r>
-      <w:r>
-        <w:t xml:space="preserve">36,</w:t>
-      </w:r>
-      <w:r>
-        <w:t xml:space="preserve"> </w:t>
-      </w:r>
-      <w:r>
-        <w:t xml:space="preserve">237</w:t>
-      </w:r>
-      <w:r>
-        <w:noBreakHyphen/>
-      </w:r>
-      <w:r>
-        <w:t xml:space="preserve">38,</w:t>
-      </w:r>
-      <w:r>
-        <w:t xml:space="preserve"> </w:t>
-      </w:r>
-      <w:r>
-        <w:t xml:space="preserve">or 237</w:t>
-      </w:r>
-      <w:r>
-        <w:noBreakHyphen/>
-      </w:r>
-      <w:r>
         <w:t xml:space="preserve">39,</w:t>
       </w:r>
       <w:r>
         <w:t xml:space="preserve"> </w:t>
       </w:r>
       <w:r>
-        <w:t xml:space="preserve">which authorize DOTAX to issue an assessment, apply; (3) there is no statutory authority permitting DOTAX to issue an assessment to a person being held liable pursuant to HRS § 237</w:t>
-      </w:r>
-      <w:r>
-        <w:noBreakHyphen/>
-      </w:r>
-      <w:r>
-        <w:t xml:space="preserve">41.5;</w:t>
-      </w:r>
-      <w:r>
-        <w:t xml:space="preserve"> </w:t>
-      </w:r>
-      <w:r>
-        <w:t xml:space="preserve">and (4) there is no statutory authority permitting a person being held liable pursuant to HRS § 237</w:t>
-      </w:r>
-      <w:r>
-        <w:noBreakHyphen/>
-      </w:r>
-      <w:r>
-        <w:t xml:space="preserve">41.5</w:t>
-      </w:r>
-      <w:r>
-        <w:t xml:space="preserve"> </w:t>
-      </w:r>
-      <w:r>
-        <w:t xml:space="preserve">to treat an imposition of liability as an assessment for purposes of appeal. Accordingly, an imposition of personal liability pursuant to HRS § 237</w:t>
-      </w:r>
-      <w:r>
-        <w:noBreakHyphen/>
-      </w:r>
-      <w:r>
-        <w:t xml:space="preserve">41.5</w:t>
+        <w:t xml:space="preserve">which authorize DOTAX to issue an assessment, apply; (3) there is no statutory authority permitting DOTAX to issue an assessment to a person being held liable pursuant to HRS § 237-⁠41.5;</w:t>
+      </w:r>
+      <w:r>
+        <w:t xml:space="preserve"> </w:t>
+      </w:r>
+      <w:r>
+        <w:t xml:space="preserve">and (4) there is no statutory authority permitting a person being held liable pursuant to HRS § 237-⁠41.5</w:t>
+      </w:r>
+      <w:r>
+        <w:t xml:space="preserve"> </w:t>
+      </w:r>
+      <w:r>
+        <w:t xml:space="preserve">to treat an imposition of liability as an assessment for purposes of appeal. Accordingly, an imposition of personal liability pursuant to HRS § 237-⁠41.5</w:t>
       </w:r>
       <w:r>
         <w:t xml:space="preserve"> </w:t>
@@ -7410,6 +7199,10 @@
         <w:t xml:space="preserve">B.</w:t>
       </w:r>
       <w:r>
+        <w:rPr>
+          <w:b/>
+          <w:bCs/>
+        </w:rPr>
         <w:tab/>
       </w:r>
       <w:r>
@@ -7607,13 +7400,7 @@
         <w:pStyle w:val="BodyText"/>
       </w:pPr>
       <w:r>
-        <w:t xml:space="preserve">HRS § 232</w:t>
-      </w:r>
-      <w:r>
-        <w:noBreakHyphen/>
-      </w:r>
-      <w:r>
-        <w:t xml:space="preserve">14.5</w:t>
+        <w:t xml:space="preserve">HRS § 232-⁠14.5</w:t>
       </w:r>
       <w:r>
         <w:t xml:space="preserve"> </w:t>
@@ -7631,13 +7418,7 @@
         <w:t xml:space="preserve"> </w:t>
       </w:r>
       <w:r>
-        <w:t xml:space="preserve">HRS § 232</w:t>
-      </w:r>
-      <w:r>
-        <w:noBreakHyphen/>
-      </w:r>
-      <w:r>
-        <w:t xml:space="preserve">14.5(a).</w:t>
+        <w:t xml:space="preserve">HRS § 232-⁠14.5(a).</w:t>
       </w:r>
       <w:r>
         <w:t xml:space="preserve"> </w:t>
@@ -7655,13 +7436,7 @@
         <w:t xml:space="preserve"> </w:t>
       </w:r>
       <w:r>
-        <w:t xml:space="preserve">HRS § 232</w:t>
-      </w:r>
-      <w:r>
-        <w:noBreakHyphen/>
-      </w:r>
-      <w:r>
-        <w:t xml:space="preserve">14.5(b).</w:t>
+        <w:t xml:space="preserve">HRS § 232-⁠14.5(b).</w:t>
       </w:r>
     </w:p>
     <w:p>
@@ -7669,13 +7444,7 @@
         <w:pStyle w:val="BodyText"/>
       </w:pPr>
       <w:r>
-        <w:t xml:space="preserve">Here, Appellant has not paid any taxes for which she has requested a refund. (Nguyen Decl. ¶ 6.) Accordingly, the Final Notice of Personal Liability of General Excise Tax is not a denial of a refund claim appealable under HRS § 232</w:t>
-      </w:r>
-      <w:r>
-        <w:noBreakHyphen/>
-      </w:r>
-      <w:r>
-        <w:t xml:space="preserve">14.5.</w:t>
+        <w:t xml:space="preserve">Here, Appellant has not paid any taxes for which she has requested a refund. (Nguyen Decl. ¶ 6.) Accordingly, the Final Notice of Personal Liability of General Excise Tax is not a denial of a refund claim appealable under HRS § 232-⁠14.5.</w:t>
       </w:r>
     </w:p>
     <w:p>
@@ -7694,6 +7463,10 @@
         <w:t xml:space="preserve">C.</w:t>
       </w:r>
       <w:r>
+        <w:rPr>
+          <w:b/>
+          <w:bCs/>
+        </w:rPr>
         <w:tab/>
       </w:r>
       <w:r>
@@ -7827,9 +7600,7 @@
           <w:b/>
           <w:bCs/>
         </w:rPr>
-        <w:t xml:space="preserve">40</w:t>
-        <w:noBreakHyphen/>
-        <w:t xml:space="preserve">35</w:t>
+        <w:t xml:space="preserve">40-⁠35</w:t>
       </w:r>
       <w:r>
         <w:rPr>
@@ -8137,9 +7908,7 @@
           <w:b/>
           <w:bCs/>
         </w:rPr>
-        <w:t xml:space="preserve">237</w:t>
-        <w:noBreakHyphen/>
-        <w:t xml:space="preserve">41.5.</w:t>
+        <w:t xml:space="preserve">237-⁠41.5.</w:t>
       </w:r>
     </w:p>
     <w:p>
@@ -8147,13 +7916,7 @@
         <w:pStyle w:val="BodyText"/>
       </w:pPr>
       <w:r>
-        <w:t xml:space="preserve">HRS § 40</w:t>
-      </w:r>
-      <w:r>
-        <w:noBreakHyphen/>
-      </w:r>
-      <w:r>
-        <w:t xml:space="preserve">35</w:t>
+        <w:t xml:space="preserve">HRS § 40-⁠35</w:t>
       </w:r>
       <w:r>
         <w:t xml:space="preserve"> </w:t>
@@ -8165,31 +7928,19 @@
         <w:t xml:space="preserve"> </w:t>
       </w:r>
       <w:r>
-        <w:t xml:space="preserve">“Any disputed portion of moneys representing a claim in favor of the State may be paid under protest to a public accountant of the department . . . The protest shall be in writing, signed by the person making the payment, or by the person’s agent, and shall set forth the grounds of protest.”</w:t>
-      </w:r>
-      <w:r>
-        <w:t xml:space="preserve"> </w:t>
-      </w:r>
-      <w:r>
-        <w:t xml:space="preserve">HRS § 40</w:t>
-      </w:r>
-      <w:r>
-        <w:noBreakHyphen/>
-      </w:r>
-      <w:r>
-        <w:t xml:space="preserve">35(a).</w:t>
-      </w:r>
-      <w:r>
-        <w:t xml:space="preserve"> </w:t>
-      </w:r>
-      <w:r>
-        <w:t xml:space="preserve">Upon making a payment under protest pursuant to HRS § 40</w:t>
-      </w:r>
-      <w:r>
-        <w:noBreakHyphen/>
-      </w:r>
-      <w:r>
-        <w:t xml:space="preserve">35(a),</w:t>
+        <w:t xml:space="preserve">“Any disputed portion of moneys representing a claim in favor of the State may be paid under protest to a public accountant of the department . . . The protest shall be in writing, signed by the person making the payment, or by the person’s agent, and shall set forth the grounds of protest.”</w:t>
+      </w:r>
+      <w:r>
+        <w:t xml:space="preserve"> </w:t>
+      </w:r>
+      <w:r>
+        <w:t xml:space="preserve">HRS § 40-⁠35(a).</w:t>
+      </w:r>
+      <w:r>
+        <w:t xml:space="preserve"> </w:t>
+      </w:r>
+      <w:r>
+        <w:t xml:space="preserve">Upon making a payment under protest pursuant to HRS § 40-⁠35(a),</w:t>
       </w:r>
       <w:r>
         <w:t xml:space="preserve"> </w:t>
@@ -8207,13 +7958,7 @@
         <w:t xml:space="preserve"> </w:t>
       </w:r>
       <w:r>
-        <w:t xml:space="preserve">HRS § 40</w:t>
-      </w:r>
-      <w:r>
-        <w:noBreakHyphen/>
-      </w:r>
-      <w:r>
-        <w:t xml:space="preserve">35(b).</w:t>
+        <w:t xml:space="preserve">HRS § 40-⁠35(b).</w:t>
       </w:r>
       <w:r>
         <w:t xml:space="preserve"> </w:t>
@@ -8243,37 +7988,19 @@
         <w:pStyle w:val="BodyText"/>
       </w:pPr>
       <w:r>
-        <w:t xml:space="preserve">Because an imposition of personal liability pursuant to HRS § 237</w:t>
-      </w:r>
-      <w:r>
-        <w:noBreakHyphen/>
-      </w:r>
-      <w:r>
-        <w:t xml:space="preserve">41.5</w:t>
-      </w:r>
-      <w:r>
-        <w:t xml:space="preserve"> </w:t>
-      </w:r>
-      <w:r>
-        <w:t xml:space="preserve">may be brought before the Tax Appeal Court by paying the disputed amount with a written protest and subsequently commencing an action in the Tax Appeal Court, the appellate remedy provided under HRS § 40</w:t>
-      </w:r>
-      <w:r>
-        <w:noBreakHyphen/>
-      </w:r>
-      <w:r>
-        <w:t xml:space="preserve">35</w:t>
-      </w:r>
-      <w:r>
-        <w:t xml:space="preserve"> </w:t>
-      </w:r>
-      <w:r>
-        <w:t xml:space="preserve">is available to persons who wish to dispute DOTAX’s determination. Moreover, because an imposition of personal liability pursuant to HRS § 237</w:t>
-      </w:r>
-      <w:r>
-        <w:noBreakHyphen/>
-      </w:r>
-      <w:r>
-        <w:t xml:space="preserve">41.5</w:t>
+        <w:t xml:space="preserve">Because an imposition of personal liability pursuant to HRS § 237-⁠41.5</w:t>
+      </w:r>
+      <w:r>
+        <w:t xml:space="preserve"> </w:t>
+      </w:r>
+      <w:r>
+        <w:t xml:space="preserve">may be brought before the Tax Appeal Court by paying the disputed amount with a written protest and subsequently commencing an action in the Tax Appeal Court, the appellate remedy provided under HRS § 40-⁠35</w:t>
+      </w:r>
+      <w:r>
+        <w:t xml:space="preserve"> </w:t>
+      </w:r>
+      <w:r>
+        <w:t xml:space="preserve">is available to persons who wish to dispute DOTAX’s determination. Moreover, because an imposition of personal liability pursuant to HRS § 237-⁠41.5</w:t>
       </w:r>
       <w:r>
         <w:t xml:space="preserve"> </w:t>
@@ -8295,13 +8022,7 @@
         <w:t xml:space="preserve"> </w:t>
       </w:r>
       <w:r>
-        <w:t xml:space="preserve">HRS § 40</w:t>
-      </w:r>
-      <w:r>
-        <w:noBreakHyphen/>
-      </w:r>
-      <w:r>
-        <w:t xml:space="preserve">35</w:t>
+        <w:t xml:space="preserve">HRS § 40-⁠35</w:t>
       </w:r>
       <w:r>
         <w:t xml:space="preserve"> </w:t>
@@ -8323,13 +8044,7 @@
         <w:t xml:space="preserve"> </w:t>
       </w:r>
       <w:r>
-        <w:t xml:space="preserve">HRS § 237</w:t>
-      </w:r>
-      <w:r>
-        <w:noBreakHyphen/>
-      </w:r>
-      <w:r>
-        <w:t xml:space="preserve">42</w:t>
+        <w:t xml:space="preserve">HRS § 237-⁠42</w:t>
       </w:r>
       <w:r>
         <w:t xml:space="preserve"> </w:t>
@@ -8351,13 +8066,7 @@
         <w:t xml:space="preserve"> </w:t>
       </w:r>
       <w:r>
-        <w:t xml:space="preserve">HRS § 232</w:t>
-      </w:r>
-      <w:r>
-        <w:noBreakHyphen/>
-      </w:r>
-      <w:r>
-        <w:t xml:space="preserve">14.5</w:t>
+        <w:t xml:space="preserve">HRS § 232-⁠14.5</w:t>
       </w:r>
       <w:r>
         <w:t xml:space="preserve"> </w:t>
@@ -8419,20 +8128,16 @@
     </w:p>
     <w:p>
       <w:pPr>
-        <w:pStyle w:val="BodyText"/>
-      </w:pPr>
-      <w:r>
-        <w:t xml:space="preserve">Based on the foregoing, the instant Motion for Partial Dismissal should be granted and the Notice of Appeal should be dismissed with respect to the Final Notice of Personal Liability for General Excise Tax for lack of subject matter jurisdiction because Appellant failed to make a payment under protest, which is the sole appellate remedy for contesting an imposition of personal liability pursuant to HRS § 237</w:t>
-      </w:r>
-      <w:r>
-        <w:noBreakHyphen/>
-      </w:r>
-      <w:r>
-        <w:t xml:space="preserve">41.5.</w:t>
-      </w:r>
-    </w:p>
-    <w:p>
-      <w:pPr>
+        <w:pStyle w:val="BodyTextKeep"/>
+      </w:pPr>
+      <w:r>
+        <w:t xml:space="preserve">Based on the foregoing, the instant Motion for Partial Dismissal should be granted and the Notice of Appeal should be dismissed with respect to the Final Notice of Personal Liability for General Excise Tax for lack of subject matter jurisdiction because Appellant failed to make a payment under protest, which is the sole appellate remedy for contesting an imposition of personal liability pursuant to HRS § 237-⁠41.5.</w:t>
+      </w:r>
+    </w:p>
+    <w:p>
+      <w:pPr>
+        <w:keepNext/>
+        <w:keepLines/>
         <w:spacing w:before="0" w:after="0" w:line="336" w:lineRule="exact"/>
       </w:pPr>
     </w:p>
@@ -8878,13 +8583,7 @@
         <w:t xml:space="preserve"> </w:t>
       </w:r>
       <w:r>
-        <w:t xml:space="preserve">HRS § 237</w:t>
-      </w:r>
-      <w:r>
-        <w:noBreakHyphen/>
-      </w:r>
-      <w:r>
-        <w:t xml:space="preserve">36.</w:t>
+        <w:t xml:space="preserve">HRS § 237-⁠36.</w:t>
       </w:r>
     </w:p>
   </w:footnote>
@@ -9825,6 +9524,15 @@
       <w:ind w:firstLine="0"/>
     </w:pPr>
   </w:style>
+  <w:style w:type="paragraph" w:customStyle="1" w:styleId="BodyTextKeep">
+    <w:name w:val="Body Text Keep"/>
+    <w:basedOn w:val="BodyText"/>
+    <w:qFormat/>
+    <w:pPr>
+      <w:keepNext/>
+      <w:keepLines/>
+    </w:pPr>
+  </w:style>
   <w:style w:type="paragraph" w:customStyle="1" w:styleId="XdList1">
     <w:name w:val="XdList 1"/>
     <w:basedOn w:val="Normal"/>
@@ -9877,6 +9585,33 @@
     <w:pPr>
       <w:spacing w:before="0" w:after="0" w:line="276" w:lineRule="exact"/>
       <w:ind w:left="2160" w:hanging="720"/>
+    </w:pPr>
+  </w:style>
+  <w:style w:type="paragraph" w:customStyle="1" w:styleId="XdQuoteList1">
+    <w:name w:val="Xd Quote List 1"/>
+    <w:basedOn w:val="Normal"/>
+    <w:qFormat/>
+    <w:pPr>
+      <w:spacing w:before="0" w:after="0" w:line="276" w:lineRule="exact"/>
+      <w:ind w:left="1440" w:right="720" w:hanging="720"/>
+    </w:pPr>
+  </w:style>
+  <w:style w:type="paragraph" w:customStyle="1" w:styleId="XdQuoteList2">
+    <w:name w:val="Xd Quote List 2"/>
+    <w:basedOn w:val="Normal"/>
+    <w:qFormat/>
+    <w:pPr>
+      <w:spacing w:before="0" w:after="0" w:line="276" w:lineRule="exact"/>
+      <w:ind w:left="2160" w:right="720" w:hanging="720"/>
+    </w:pPr>
+  </w:style>
+  <w:style w:type="paragraph" w:customStyle="1" w:styleId="XdQuoteList3">
+    <w:name w:val="Xd Quote List 3"/>
+    <w:basedOn w:val="Normal"/>
+    <w:qFormat/>
+    <w:pPr>
+      <w:spacing w:before="0" w:after="0" w:line="276" w:lineRule="exact"/>
+      <w:ind w:left="2880" w:right="720" w:hanging="720"/>
     </w:pPr>
   </w:style>
   <w:style w:type="paragraph" w:customStyle="1" w:styleId="XdQuote">

</xml_diff>